<commit_message>
Move the gate register docs from Render/Vercel/Supabase to AWS
Co-Authored-By: Claude Opus 5.5 <noreply@anthropic.com>
</commit_message>
<xml_diff>
--- a/docs/Gate Register - Deployment Guide.docx
+++ b/docs/Gate Register - Deployment Guide.docx
@@ -18,7 +18,7 @@
         <w:rPr>
           <w:color w:val="595959"/>
         </w:rPr>
-        <w:t xml:space="preserve">How to put the gate entry/exit feature live in the existing dashboard</w:t>
+        <w:t xml:space="preserve">How to put the gate entry/exit feature live in the existing dashboard, on AWS</w:t>
       </w:r>
     </w:p>
     <w:p>
@@ -40,7 +40,7 @@
         <w:spacing w:after="60"/>
       </w:pPr>
       <w:r>
-        <w:t xml:space="preserve">Database: visitors, gate entries and the people on each entry, plus a private photo bucket.</w:t>
+        <w:t xml:space="preserve">Database (RDS): visitors, gate entries and the people on each entry.</w:t>
       </w:r>
     </w:p>
     <w:p>
@@ -53,7 +53,20 @@
         <w:spacing w:after="60"/>
       </w:pPr>
       <w:r>
-        <w:t xml:space="preserve">Backend: the gate API (register entry, approve, admit, exit, gate register report).</w:t>
+        <w:t xml:space="preserve">Photo storage (S3): a private bucket for visitor ID photos.</w:t>
+      </w:r>
+    </w:p>
+    <w:p>
+      <w:pPr>
+        <w:pStyle w:val="ListParagraph"/>
+        <w:numPr>
+          <w:ilvl w:val="0"/>
+          <w:numId w:val="2"/>
+        </w:numPr>
+        <w:spacing w:after="60"/>
+      </w:pPr>
+      <w:r>
+        <w:t xml:space="preserve">Backend (EC2): the gate API (register entry, approve, admit, exit, gate register report).</w:t>
       </w:r>
     </w:p>
     <w:p>
@@ -88,7 +101,7 @@
         <w:spacing w:after="60"/>
       </w:pPr>
       <w:r>
-        <w:t xml:space="preserve">Access to the database (Supabase) and the hosting account (Render).</w:t>
+        <w:t xml:space="preserve">An AWS account with access to EC2, RDS and S3.</w:t>
       </w:r>
     </w:p>
     <w:p>
@@ -114,7 +127,20 @@
         <w:spacing w:after="60"/>
       </w:pPr>
       <w:r>
-        <w:t xml:space="preserve">Email addresses of the 2 users.</w:t>
+        <w:t xml:space="preserve">A subdomain for the API (e.g. gate-api.yourdomain.com).</w:t>
+      </w:r>
+    </w:p>
+    <w:p>
+      <w:pPr>
+        <w:pStyle w:val="ListParagraph"/>
+        <w:numPr>
+          <w:ilvl w:val="0"/>
+          <w:numId w:val="2"/>
+        </w:numPr>
+        <w:spacing w:after="60"/>
+      </w:pPr>
+      <w:r>
+        <w:t xml:space="preserve">The feature’s login and photo upload code switched to the dashboard login and S3.</w:t>
       </w:r>
     </w:p>
     <w:p>
@@ -128,14 +154,14 @@
     </w:p>
     <w:p>
       <w:pPr>
-        <w:spacing w:after="60"/>
+        <w:spacing w:after="60" w:before="0"/>
       </w:pPr>
       <w:r>
         <w:rPr>
           <w:b/>
           <w:bCs/>
         </w:rPr>
-        <w:t xml:space="preserve">Database</w:t>
+        <w:t xml:space="preserve">Database (RDS)</w:t>
       </w:r>
     </w:p>
     <w:p>
@@ -148,7 +174,20 @@
         <w:spacing w:after="60"/>
       </w:pPr>
       <w:r>
-        <w:t xml:space="preserve">Run the gate migration scripts on the database (tables, security rules, photo bucket).</w:t>
+        <w:t xml:space="preserve">Create an RDS PostgreSQL database (db.t3.micro, 20 GB, private), or use the existing one.</w:t>
+      </w:r>
+    </w:p>
+    <w:p>
+      <w:pPr>
+        <w:pStyle w:val="ListParagraph"/>
+        <w:numPr>
+          <w:ilvl w:val="0"/>
+          <w:numId w:val="3"/>
+        </w:numPr>
+        <w:spacing w:after="60"/>
+      </w:pPr>
+      <w:r>
+        <w:t xml:space="preserve">Run the gate migration scripts to create the tables.</w:t>
       </w:r>
     </w:p>
     <w:p>
@@ -173,7 +212,7 @@
           <w:b/>
           <w:bCs/>
         </w:rPr>
-        <w:t xml:space="preserve">Backend</w:t>
+        <w:t xml:space="preserve">Photo storage (S3)</w:t>
       </w:r>
     </w:p>
     <w:p>
@@ -186,7 +225,7 @@
         <w:spacing w:after="60"/>
       </w:pPr>
       <w:r>
-        <w:t xml:space="preserve">Create a Python web service on Render from the backend folder.</w:t>
+        <w:t xml:space="preserve">Create a private S3 bucket (e.g. gate-id-photos) with public access blocked.</w:t>
       </w:r>
     </w:p>
     <w:p>
@@ -199,28 +238,66 @@
         <w:spacing w:after="60"/>
       </w:pPr>
       <w:r>
-        <w:t xml:space="preserve">Build command: pip install -r requirements.txt</w:t>
-      </w:r>
-    </w:p>
-    <w:p>
-      <w:pPr>
-        <w:pStyle w:val="ListParagraph"/>
-        <w:numPr>
-          <w:ilvl w:val="0"/>
-          <w:numId w:val="4"/>
-        </w:numPr>
-        <w:spacing w:after="60"/>
-      </w:pPr>
-      <w:r>
-        <w:t xml:space="preserve">Start command: uvicorn app.main:app --host 0.0.0.0 --port $PORT</w:t>
-      </w:r>
-    </w:p>
-    <w:p>
-      <w:pPr>
-        <w:pStyle w:val="ListParagraph"/>
-        <w:numPr>
-          <w:ilvl w:val="0"/>
-          <w:numId w:val="4"/>
+        <w:t xml:space="preserve">Create an IAM role that can read and write only this bucket, and attach it to the EC2 instance.</w:t>
+      </w:r>
+    </w:p>
+    <w:p>
+      <w:pPr>
+        <w:spacing w:after="60" w:before="120"/>
+      </w:pPr>
+      <w:r>
+        <w:rPr>
+          <w:b/>
+          <w:bCs/>
+        </w:rPr>
+        <w:t xml:space="preserve">Backend (EC2)</w:t>
+      </w:r>
+    </w:p>
+    <w:p>
+      <w:pPr>
+        <w:pStyle w:val="ListParagraph"/>
+        <w:numPr>
+          <w:ilvl w:val="0"/>
+          <w:numId w:val="5"/>
+        </w:numPr>
+        <w:spacing w:after="60"/>
+      </w:pPr>
+      <w:r>
+        <w:t xml:space="preserve">Launch a t3.micro Ubuntu instance in ap-south-1. Allow ports 80 and 443 only.</w:t>
+      </w:r>
+    </w:p>
+    <w:p>
+      <w:pPr>
+        <w:pStyle w:val="ListParagraph"/>
+        <w:numPr>
+          <w:ilvl w:val="0"/>
+          <w:numId w:val="5"/>
+        </w:numPr>
+        <w:spacing w:after="60"/>
+      </w:pPr>
+      <w:r>
+        <w:t xml:space="preserve">Install Python 3.11 and Nginx, then copy the backend folder to the server.</w:t>
+      </w:r>
+    </w:p>
+    <w:p>
+      <w:pPr>
+        <w:pStyle w:val="ListParagraph"/>
+        <w:numPr>
+          <w:ilvl w:val="0"/>
+          <w:numId w:val="5"/>
+        </w:numPr>
+        <w:spacing w:after="60"/>
+      </w:pPr>
+      <w:r>
+        <w:t xml:space="preserve">Run: pip install -r requirements.txt</w:t>
+      </w:r>
+    </w:p>
+    <w:p>
+      <w:pPr>
+        <w:pStyle w:val="ListParagraph"/>
+        <w:numPr>
+          <w:ilvl w:val="0"/>
+          <w:numId w:val="5"/>
         </w:numPr>
         <w:spacing w:after="60"/>
       </w:pPr>
@@ -233,12 +310,38 @@
         <w:pStyle w:val="ListParagraph"/>
         <w:numPr>
           <w:ilvl w:val="0"/>
-          <w:numId w:val="4"/>
-        </w:numPr>
-        <w:spacing w:after="60"/>
-      </w:pPr>
-      <w:r>
-        <w:t xml:space="preserve">Deploy, then open /health and confirm it says OK.</w:t>
+          <w:numId w:val="5"/>
+        </w:numPr>
+        <w:spacing w:after="60"/>
+      </w:pPr>
+      <w:r>
+        <w:t xml:space="preserve">Run the API as a service: uvicorn app.main:app --host 127.0.0.1 --port 8000</w:t>
+      </w:r>
+    </w:p>
+    <w:p>
+      <w:pPr>
+        <w:pStyle w:val="ListParagraph"/>
+        <w:numPr>
+          <w:ilvl w:val="0"/>
+          <w:numId w:val="5"/>
+        </w:numPr>
+        <w:spacing w:after="60"/>
+      </w:pPr>
+      <w:r>
+        <w:t xml:space="preserve">Point the subdomain to the instance and set up Nginx with a free SSL certificate (Certbot).</w:t>
+      </w:r>
+    </w:p>
+    <w:p>
+      <w:pPr>
+        <w:pStyle w:val="ListParagraph"/>
+        <w:numPr>
+          <w:ilvl w:val="0"/>
+          <w:numId w:val="5"/>
+        </w:numPr>
+        <w:spacing w:after="60"/>
+      </w:pPr>
+      <w:r>
+        <w:t xml:space="preserve">Open https://&lt;api-subdomain&gt;/health and confirm it says OK.</w:t>
       </w:r>
     </w:p>
     <w:p>
@@ -258,33 +361,33 @@
         <w:pStyle w:val="ListParagraph"/>
         <w:numPr>
           <w:ilvl w:val="0"/>
-          <w:numId w:val="5"/>
-        </w:numPr>
-        <w:spacing w:after="60"/>
-      </w:pPr>
-      <w:r>
-        <w:t xml:space="preserve">Copy the Gate Entry page and the badge/photo components into the dashboard.</w:t>
-      </w:r>
-    </w:p>
-    <w:p>
-      <w:pPr>
-        <w:pStyle w:val="ListParagraph"/>
-        <w:numPr>
-          <w:ilvl w:val="0"/>
-          <w:numId w:val="5"/>
-        </w:numPr>
-        <w:spacing w:after="60"/>
-      </w:pPr>
-      <w:r>
-        <w:t xml:space="preserve">Add a menu link for "Gate Entry" and "Gate Register".</w:t>
-      </w:r>
-    </w:p>
-    <w:p>
-      <w:pPr>
-        <w:pStyle w:val="ListParagraph"/>
-        <w:numPr>
-          <w:ilvl w:val="0"/>
-          <w:numId w:val="5"/>
+          <w:numId w:val="6"/>
+        </w:numPr>
+        <w:spacing w:after="60"/>
+      </w:pPr>
+      <w:r>
+        <w:t xml:space="preserve">Copy the Gate Entry page and the photo/badge components into the dashboard.</w:t>
+      </w:r>
+    </w:p>
+    <w:p>
+      <w:pPr>
+        <w:pStyle w:val="ListParagraph"/>
+        <w:numPr>
+          <w:ilvl w:val="0"/>
+          <w:numId w:val="6"/>
+        </w:numPr>
+        <w:spacing w:after="60"/>
+      </w:pPr>
+      <w:r>
+        <w:t xml:space="preserve">Add menu links for "Gate Entry" and "Gate Register".</w:t>
+      </w:r>
+    </w:p>
+    <w:p>
+      <w:pPr>
+        <w:pStyle w:val="ListParagraph"/>
+        <w:numPr>
+          <w:ilvl w:val="0"/>
+          <w:numId w:val="6"/>
         </w:numPr>
         <w:spacing w:after="60"/>
       </w:pPr>
@@ -297,7 +400,7 @@
         <w:pStyle w:val="ListParagraph"/>
         <w:numPr>
           <w:ilvl w:val="0"/>
-          <w:numId w:val="5"/>
+          <w:numId w:val="6"/>
         </w:numPr>
         <w:spacing w:after="60"/>
       </w:pPr>
@@ -322,12 +425,12 @@
         <w:pStyle w:val="ListParagraph"/>
         <w:numPr>
           <w:ilvl w:val="0"/>
-          <w:numId w:val="6"/>
-        </w:numPr>
-        <w:spacing w:after="60"/>
-      </w:pPr>
-      <w:r>
-        <w:t xml:space="preserve">Create the 2 accounts: one with the Security Guard role, one with the Ops Manager role.</w:t>
+          <w:numId w:val="7"/>
+        </w:numPr>
+        <w:spacing w:after="60"/>
+      </w:pPr>
+      <w:r>
+        <w:t xml:space="preserve">Create the 2 accounts: one Security Guard, one Ops Manager (approver).</w:t>
       </w:r>
     </w:p>
     <w:p>
@@ -460,7 +563,7 @@
                 <w:b w:val="false"/>
                 <w:bCs w:val="false"/>
               </w:rPr>
-              <w:t xml:space="preserve">Database connection (api_user role)</w:t>
+              <w:t xml:space="preserve">RDS connection string</w:t>
             </w:r>
           </w:p>
         </w:tc>
@@ -488,7 +591,7 @@
                 <w:b w:val="false"/>
                 <w:bCs w:val="false"/>
               </w:rPr>
-              <w:t xml:space="preserve">SUPABASE_URL</w:t>
+              <w:t xml:space="preserve">S3_BUCKET</w:t>
             </w:r>
           </w:p>
         </w:tc>
@@ -514,7 +617,7 @@
                 <w:b w:val="false"/>
                 <w:bCs w:val="false"/>
               </w:rPr>
-              <w:t xml:space="preserve">Supabase project URL</w:t>
+              <w:t xml:space="preserve">Photo bucket name</w:t>
             </w:r>
           </w:p>
         </w:tc>
@@ -542,7 +645,7 @@
                 <w:b w:val="false"/>
                 <w:bCs w:val="false"/>
               </w:rPr>
-              <w:t xml:space="preserve">SUPABASE_ANON_KEY</w:t>
+              <w:t xml:space="preserve">AWS_REGION</w:t>
             </w:r>
           </w:p>
         </w:tc>
@@ -568,7 +671,7 @@
                 <w:b w:val="false"/>
                 <w:bCs w:val="false"/>
               </w:rPr>
-              <w:t xml:space="preserve">Supabase public key</w:t>
+              <w:t xml:space="preserve">ap-south-1</w:t>
             </w:r>
           </w:p>
         </w:tc>
@@ -596,7 +699,7 @@
                 <w:b w:val="false"/>
                 <w:bCs w:val="false"/>
               </w:rPr>
-              <w:t xml:space="preserve">SUPABASE_SERVICE_ROLE_KEY</w:t>
+              <w:t xml:space="preserve">JWT_SECRET</w:t>
             </w:r>
           </w:p>
         </w:tc>
@@ -622,61 +725,7 @@
                 <w:b w:val="false"/>
                 <w:bCs w:val="false"/>
               </w:rPr>
-              <w:t xml:space="preserve">Supabase service key (keep secret)</w:t>
-            </w:r>
-          </w:p>
-        </w:tc>
-      </w:tr>
-      <w:tr>
-        <w:tc>
-          <w:tcPr>
-            <w:tcW w:type="dxa" w:w="3400"/>
-            <w:tcBorders>
-              <w:top w:val="single" w:color="BFBFBF" w:sz="4"/>
-              <w:left w:val="single" w:color="BFBFBF" w:sz="4"/>
-              <w:bottom w:val="single" w:color="BFBFBF" w:sz="4"/>
-              <w:right w:val="single" w:color="BFBFBF" w:sz="4"/>
-            </w:tcBorders>
-            <w:tcMar>
-              <w:top w:type="dxa" w:w="60"/>
-              <w:left w:type="dxa" w:w="100"/>
-              <w:bottom w:type="dxa" w:w="60"/>
-              <w:right w:type="dxa" w:w="100"/>
-            </w:tcMar>
-          </w:tcPr>
-          <w:p>
-            <w:r>
-              <w:rPr>
-                <w:b w:val="false"/>
-                <w:bCs w:val="false"/>
-              </w:rPr>
-              <w:t xml:space="preserve">SUPABASE_JWT_SECRET</w:t>
-            </w:r>
-          </w:p>
-        </w:tc>
-        <w:tc>
-          <w:tcPr>
-            <w:tcW w:type="dxa" w:w="5626"/>
-            <w:tcBorders>
-              <w:top w:val="single" w:color="BFBFBF" w:sz="4"/>
-              <w:left w:val="single" w:color="BFBFBF" w:sz="4"/>
-              <w:bottom w:val="single" w:color="BFBFBF" w:sz="4"/>
-              <w:right w:val="single" w:color="BFBFBF" w:sz="4"/>
-            </w:tcBorders>
-            <w:tcMar>
-              <w:top w:type="dxa" w:w="60"/>
-              <w:left w:type="dxa" w:w="100"/>
-              <w:bottom w:type="dxa" w:w="60"/>
-              <w:right w:type="dxa" w:w="100"/>
-            </w:tcMar>
-          </w:tcPr>
-          <w:p>
-            <w:r>
-              <w:rPr>
-                <w:b w:val="false"/>
-                <w:bCs w:val="false"/>
-              </w:rPr>
-              <w:t xml:space="preserve">Supabase JWT secret (keep secret)</w:t>
+              <w:t xml:space="preserve">Secret used by the dashboard login (keep secret)</w:t>
             </w:r>
           </w:p>
         </w:tc>
@@ -792,6 +841,14 @@
     </w:tbl>
     <w:p>
       <w:pPr>
+        <w:spacing w:after="120" w:before="120"/>
+      </w:pPr>
+      <w:r>
+        <w:t xml:space="preserve">No AWS keys are needed on the server; the EC2 IAM role gives access to S3.</w:t>
+      </w:r>
+    </w:p>
+    <w:p>
+      <w:pPr>
         <w:pStyle w:val="Heading1"/>
         <w:spacing w:after="120" w:before="240"/>
       </w:pPr>
@@ -809,7 +866,7 @@
         <w:spacing w:after="60"/>
       </w:pPr>
       <w:r>
-        <w:t xml:space="preserve">Guard logs in, enters a mobile number and registers a vehicle with a driver.</w:t>
+        <w:t xml:space="preserve">Guard logs in, enters a mobile number and registers a vehicle with a driver and photo.</w:t>
       </w:r>
     </w:p>
     <w:p>
@@ -883,7 +940,7 @@
         <w:spacing w:after="60"/>
       </w:pPr>
       <w:r>
-        <w:t xml:space="preserve">Roll back by redeploying the previous version on Render and in the dashboard.</w:t>
+        <w:t xml:space="preserve">Roll back by deploying the previous backend version on EC2 and the previous dashboard version.</w:t>
       </w:r>
     </w:p>
     <w:p>
@@ -896,7 +953,20 @@
         <w:spacing w:after="60"/>
       </w:pPr>
       <w:r>
-        <w:t xml:space="preserve">Database tables are new, so they do not affect the existing dashboard.</w:t>
+        <w:t xml:space="preserve">The gate tables are new, so they do not affect the existing dashboard.</w:t>
+      </w:r>
+    </w:p>
+    <w:p>
+      <w:pPr>
+        <w:pStyle w:val="ListParagraph"/>
+        <w:numPr>
+          <w:ilvl w:val="0"/>
+          <w:numId w:val="2"/>
+        </w:numPr>
+        <w:spacing w:after="60"/>
+      </w:pPr>
+      <w:r>
+        <w:t xml:space="preserve">RDS keeps 7 days of backups if data needs restoring.</w:t>
       </w:r>
     </w:p>
     <w:sectPr>
@@ -1118,6 +1188,18 @@
     </w:lvl>
   </w:abstractNum>
   <w:abstractNum w:abstractNumId="6" w15:restartNumberingAfterBreak="0">
+    <w:multiLevelType w:val="hybridMultilevel"/>
+    <w:lvl w:ilvl="0" w:tentative="1">
+      <w:start w:val="1"/>
+      <w:numFmt w:val="decimal"/>
+      <w:lvlText w:val="%1."/>
+      <w:lvlJc w:val="left"/>
+      <w:pPr>
+        <w:ind w:left="540" w:hanging="360"/>
+      </w:pPr>
+    </w:lvl>
+  </w:abstractNum>
+  <w:abstractNum w:abstractNumId="7" w15:restartNumberingAfterBreak="0">
     <w:multiLevelType w:val="hybridMultilevel"/>
     <w:lvl w:ilvl="0" w:tentative="1">
       <w:start w:val="1"/>
@@ -1161,6 +1243,12 @@
   </w:num>
   <w:num w:numId="6">
     <w:abstractNumId w:val="6"/>
+    <w:lvlOverride w:ilvl="0">
+      <w:startOverride w:val="1"/>
+    </w:lvlOverride>
+  </w:num>
+  <w:num w:numId="7">
+    <w:abstractNumId w:val="7"/>
     <w:lvlOverride w:ilvl="0">
       <w:startOverride w:val="1"/>
     </w:lvlOverride>

</xml_diff>

<commit_message>
Reduce the gate deployment doc to what deployment needs
Co-Authored-By: Claude Opus 5.5 <noreply@anthropic.com>
</commit_message>
<xml_diff>
--- a/docs/Gate Register - Deployment Guide.docx
+++ b/docs/Gate Register - Deployment Guide.docx
@@ -7,7 +7,7 @@
         <w:pStyle w:val="Title"/>
       </w:pPr>
       <w:r>
-        <w:t xml:space="preserve">Gate Register: Deployment Guide</w:t>
+        <w:t xml:space="preserve">Gate Register: Deployment Requirements</w:t>
       </w:r>
     </w:p>
     <w:p>
@@ -18,7 +18,7 @@
         <w:rPr>
           <w:color w:val="595959"/>
         </w:rPr>
-        <w:t xml:space="preserve">How to put the gate entry/exit feature live in the existing dashboard, on AWS</w:t>
+        <w:t xml:space="preserve">Everything needed to deploy the gate entry/exit feature into the existing dashboard on AWS</w:t>
       </w:r>
     </w:p>
     <w:p>
@@ -27,7 +27,305 @@
         <w:spacing w:after="120" w:before="240"/>
       </w:pPr>
       <w:r>
-        <w:t xml:space="preserve">1. What Gets Deployed</w:t>
+        <w:t xml:space="preserve">1. AWS Resources</w:t>
+      </w:r>
+    </w:p>
+    <w:tbl>
+      <w:tblPr>
+        <w:tblW w:type="dxa" w:w="9026"/>
+        <w:tblBorders>
+          <w:top w:val="single" w:color="auto" w:sz="4"/>
+          <w:left w:val="single" w:color="auto" w:sz="4"/>
+          <w:bottom w:val="single" w:color="auto" w:sz="4"/>
+          <w:right w:val="single" w:color="auto" w:sz="4"/>
+          <w:insideH w:val="single" w:color="auto" w:sz="4"/>
+          <w:insideV w:val="single" w:color="auto" w:sz="4"/>
+        </w:tblBorders>
+      </w:tblPr>
+      <w:tblGrid>
+        <w:gridCol w:w="2600"/>
+        <w:gridCol w:w="6426"/>
+      </w:tblGrid>
+      <w:tr>
+        <w:tc>
+          <w:tcPr>
+            <w:tcW w:type="dxa" w:w="2600"/>
+            <w:tcBorders>
+              <w:top w:val="single" w:color="BFBFBF" w:sz="4"/>
+              <w:left w:val="single" w:color="BFBFBF" w:sz="4"/>
+              <w:bottom w:val="single" w:color="BFBFBF" w:sz="4"/>
+              <w:right w:val="single" w:color="BFBFBF" w:sz="4"/>
+            </w:tcBorders>
+            <w:shd w:fill="D9E2F3" w:color="auto" w:val="clear"/>
+            <w:tcMar>
+              <w:top w:type="dxa" w:w="60"/>
+              <w:left w:type="dxa" w:w="100"/>
+              <w:bottom w:type="dxa" w:w="60"/>
+              <w:right w:type="dxa" w:w="100"/>
+            </w:tcMar>
+          </w:tcPr>
+          <w:p>
+            <w:r>
+              <w:rPr>
+                <w:b/>
+                <w:bCs/>
+              </w:rPr>
+              <w:t xml:space="preserve">Resource</w:t>
+            </w:r>
+          </w:p>
+        </w:tc>
+        <w:tc>
+          <w:tcPr>
+            <w:tcW w:type="dxa" w:w="6426"/>
+            <w:tcBorders>
+              <w:top w:val="single" w:color="BFBFBF" w:sz="4"/>
+              <w:left w:val="single" w:color="BFBFBF" w:sz="4"/>
+              <w:bottom w:val="single" w:color="BFBFBF" w:sz="4"/>
+              <w:right w:val="single" w:color="BFBFBF" w:sz="4"/>
+            </w:tcBorders>
+            <w:shd w:fill="D9E2F3" w:color="auto" w:val="clear"/>
+            <w:tcMar>
+              <w:top w:type="dxa" w:w="60"/>
+              <w:left w:type="dxa" w:w="100"/>
+              <w:bottom w:type="dxa" w:w="60"/>
+              <w:right w:type="dxa" w:w="100"/>
+            </w:tcMar>
+          </w:tcPr>
+          <w:p>
+            <w:r>
+              <w:rPr>
+                <w:b/>
+                <w:bCs/>
+              </w:rPr>
+              <w:t xml:space="preserve">Details</w:t>
+            </w:r>
+          </w:p>
+        </w:tc>
+      </w:tr>
+      <w:tr>
+        <w:tc>
+          <w:tcPr>
+            <w:tcW w:type="dxa" w:w="2600"/>
+            <w:tcBorders>
+              <w:top w:val="single" w:color="BFBFBF" w:sz="4"/>
+              <w:left w:val="single" w:color="BFBFBF" w:sz="4"/>
+              <w:bottom w:val="single" w:color="BFBFBF" w:sz="4"/>
+              <w:right w:val="single" w:color="BFBFBF" w:sz="4"/>
+            </w:tcBorders>
+            <w:tcMar>
+              <w:top w:type="dxa" w:w="60"/>
+              <w:left w:type="dxa" w:w="100"/>
+              <w:bottom w:type="dxa" w:w="60"/>
+              <w:right w:type="dxa" w:w="100"/>
+            </w:tcMar>
+          </w:tcPr>
+          <w:p>
+            <w:r>
+              <w:rPr>
+                <w:b w:val="false"/>
+                <w:bCs w:val="false"/>
+              </w:rPr>
+              <w:t xml:space="preserve">EC2</w:t>
+            </w:r>
+          </w:p>
+        </w:tc>
+        <w:tc>
+          <w:tcPr>
+            <w:tcW w:type="dxa" w:w="6426"/>
+            <w:tcBorders>
+              <w:top w:val="single" w:color="BFBFBF" w:sz="4"/>
+              <w:left w:val="single" w:color="BFBFBF" w:sz="4"/>
+              <w:bottom w:val="single" w:color="BFBFBF" w:sz="4"/>
+              <w:right w:val="single" w:color="BFBFBF" w:sz="4"/>
+            </w:tcBorders>
+            <w:tcMar>
+              <w:top w:type="dxa" w:w="60"/>
+              <w:left w:type="dxa" w:w="100"/>
+              <w:bottom w:type="dxa" w:w="60"/>
+              <w:right w:type="dxa" w:w="100"/>
+            </w:tcMar>
+          </w:tcPr>
+          <w:p>
+            <w:r>
+              <w:rPr>
+                <w:b w:val="false"/>
+                <w:bCs w:val="false"/>
+              </w:rPr>
+              <w:t xml:space="preserve">1 × t3.micro, Ubuntu, ap-south-1 (Mumbai), ports 80 and 443 open</w:t>
+            </w:r>
+          </w:p>
+        </w:tc>
+      </w:tr>
+      <w:tr>
+        <w:tc>
+          <w:tcPr>
+            <w:tcW w:type="dxa" w:w="2600"/>
+            <w:tcBorders>
+              <w:top w:val="single" w:color="BFBFBF" w:sz="4"/>
+              <w:left w:val="single" w:color="BFBFBF" w:sz="4"/>
+              <w:bottom w:val="single" w:color="BFBFBF" w:sz="4"/>
+              <w:right w:val="single" w:color="BFBFBF" w:sz="4"/>
+            </w:tcBorders>
+            <w:tcMar>
+              <w:top w:type="dxa" w:w="60"/>
+              <w:left w:type="dxa" w:w="100"/>
+              <w:bottom w:type="dxa" w:w="60"/>
+              <w:right w:type="dxa" w:w="100"/>
+            </w:tcMar>
+          </w:tcPr>
+          <w:p>
+            <w:r>
+              <w:rPr>
+                <w:b w:val="false"/>
+                <w:bCs w:val="false"/>
+              </w:rPr>
+              <w:t xml:space="preserve">RDS PostgreSQL</w:t>
+            </w:r>
+          </w:p>
+        </w:tc>
+        <w:tc>
+          <w:tcPr>
+            <w:tcW w:type="dxa" w:w="6426"/>
+            <w:tcBorders>
+              <w:top w:val="single" w:color="BFBFBF" w:sz="4"/>
+              <w:left w:val="single" w:color="BFBFBF" w:sz="4"/>
+              <w:bottom w:val="single" w:color="BFBFBF" w:sz="4"/>
+              <w:right w:val="single" w:color="BFBFBF" w:sz="4"/>
+            </w:tcBorders>
+            <w:tcMar>
+              <w:top w:type="dxa" w:w="60"/>
+              <w:left w:type="dxa" w:w="100"/>
+              <w:bottom w:type="dxa" w:w="60"/>
+              <w:right w:type="dxa" w:w="100"/>
+            </w:tcMar>
+          </w:tcPr>
+          <w:p>
+            <w:r>
+              <w:rPr>
+                <w:b w:val="false"/>
+                <w:bCs w:val="false"/>
+              </w:rPr>
+              <w:t xml:space="preserve">1 × db.t3.micro, 20 GB, private, 7-day backups (or the existing RDS)</w:t>
+            </w:r>
+          </w:p>
+        </w:tc>
+      </w:tr>
+      <w:tr>
+        <w:tc>
+          <w:tcPr>
+            <w:tcW w:type="dxa" w:w="2600"/>
+            <w:tcBorders>
+              <w:top w:val="single" w:color="BFBFBF" w:sz="4"/>
+              <w:left w:val="single" w:color="BFBFBF" w:sz="4"/>
+              <w:bottom w:val="single" w:color="BFBFBF" w:sz="4"/>
+              <w:right w:val="single" w:color="BFBFBF" w:sz="4"/>
+            </w:tcBorders>
+            <w:tcMar>
+              <w:top w:type="dxa" w:w="60"/>
+              <w:left w:type="dxa" w:w="100"/>
+              <w:bottom w:type="dxa" w:w="60"/>
+              <w:right w:type="dxa" w:w="100"/>
+            </w:tcMar>
+          </w:tcPr>
+          <w:p>
+            <w:r>
+              <w:rPr>
+                <w:b w:val="false"/>
+                <w:bCs w:val="false"/>
+              </w:rPr>
+              <w:t xml:space="preserve">S3</w:t>
+            </w:r>
+          </w:p>
+        </w:tc>
+        <w:tc>
+          <w:tcPr>
+            <w:tcW w:type="dxa" w:w="6426"/>
+            <w:tcBorders>
+              <w:top w:val="single" w:color="BFBFBF" w:sz="4"/>
+              <w:left w:val="single" w:color="BFBFBF" w:sz="4"/>
+              <w:bottom w:val="single" w:color="BFBFBF" w:sz="4"/>
+              <w:right w:val="single" w:color="BFBFBF" w:sz="4"/>
+            </w:tcBorders>
+            <w:tcMar>
+              <w:top w:type="dxa" w:w="60"/>
+              <w:left w:type="dxa" w:w="100"/>
+              <w:bottom w:type="dxa" w:w="60"/>
+              <w:right w:type="dxa" w:w="100"/>
+            </w:tcMar>
+          </w:tcPr>
+          <w:p>
+            <w:r>
+              <w:rPr>
+                <w:b w:val="false"/>
+                <w:bCs w:val="false"/>
+              </w:rPr>
+              <w:t xml:space="preserve">1 private bucket for visitor ID photos, public access blocked</w:t>
+            </w:r>
+          </w:p>
+        </w:tc>
+      </w:tr>
+      <w:tr>
+        <w:tc>
+          <w:tcPr>
+            <w:tcW w:type="dxa" w:w="2600"/>
+            <w:tcBorders>
+              <w:top w:val="single" w:color="BFBFBF" w:sz="4"/>
+              <w:left w:val="single" w:color="BFBFBF" w:sz="4"/>
+              <w:bottom w:val="single" w:color="BFBFBF" w:sz="4"/>
+              <w:right w:val="single" w:color="BFBFBF" w:sz="4"/>
+            </w:tcBorders>
+            <w:tcMar>
+              <w:top w:type="dxa" w:w="60"/>
+              <w:left w:type="dxa" w:w="100"/>
+              <w:bottom w:type="dxa" w:w="60"/>
+              <w:right w:type="dxa" w:w="100"/>
+            </w:tcMar>
+          </w:tcPr>
+          <w:p>
+            <w:r>
+              <w:rPr>
+                <w:b w:val="false"/>
+                <w:bCs w:val="false"/>
+              </w:rPr>
+              <w:t xml:space="preserve">IAM role</w:t>
+            </w:r>
+          </w:p>
+        </w:tc>
+        <w:tc>
+          <w:tcPr>
+            <w:tcW w:type="dxa" w:w="6426"/>
+            <w:tcBorders>
+              <w:top w:val="single" w:color="BFBFBF" w:sz="4"/>
+              <w:left w:val="single" w:color="BFBFBF" w:sz="4"/>
+              <w:bottom w:val="single" w:color="BFBFBF" w:sz="4"/>
+              <w:right w:val="single" w:color="BFBFBF" w:sz="4"/>
+            </w:tcBorders>
+            <w:tcMar>
+              <w:top w:type="dxa" w:w="60"/>
+              <w:left w:type="dxa" w:w="100"/>
+              <w:bottom w:type="dxa" w:w="60"/>
+              <w:right w:type="dxa" w:w="100"/>
+            </w:tcMar>
+          </w:tcPr>
+          <w:p>
+            <w:r>
+              <w:rPr>
+                <w:b w:val="false"/>
+                <w:bCs w:val="false"/>
+              </w:rPr>
+              <w:t xml:space="preserve">Attached to EC2, read/write access to the photo bucket only</w:t>
+            </w:r>
+          </w:p>
+        </w:tc>
+      </w:tr>
+    </w:tbl>
+    <w:p>
+      <w:pPr>
+        <w:pStyle w:val="Heading1"/>
+        <w:spacing w:after="120" w:before="240"/>
+      </w:pPr>
+      <w:r>
+        <w:t xml:space="preserve">2. Software on the Server</w:t>
       </w:r>
     </w:p>
     <w:p>
@@ -40,7 +338,7 @@
         <w:spacing w:after="60"/>
       </w:pPr>
       <w:r>
-        <w:t xml:space="preserve">Database (RDS): visitors, gate entries and the people on each entry.</w:t>
+        <w:t xml:space="preserve">Python 3.11</w:t>
       </w:r>
     </w:p>
     <w:p>
@@ -53,7 +351,7 @@
         <w:spacing w:after="60"/>
       </w:pPr>
       <w:r>
-        <w:t xml:space="preserve">Photo storage (S3): a private bucket for visitor ID photos.</w:t>
+        <w:t xml:space="preserve">Nginx</w:t>
       </w:r>
     </w:p>
     <w:p>
@@ -66,7 +364,7 @@
         <w:spacing w:after="60"/>
       </w:pPr>
       <w:r>
-        <w:t xml:space="preserve">Backend (EC2): the gate API (register entry, approve, admit, exit, gate register report).</w:t>
+        <w:t xml:space="preserve">Free SSL certificate (Certbot / Let’s Encrypt)</w:t>
       </w:r>
     </w:p>
     <w:p>
@@ -79,7 +377,7 @@
         <w:spacing w:after="60"/>
       </w:pPr>
       <w:r>
-        <w:t xml:space="preserve">Frontend: the Gate Entry screen and the Gate Register report, added as pages in the dashboard.</w:t>
+        <w:t xml:space="preserve">Backend Python packages (listed in requirements.txt)</w:t>
       </w:r>
     </w:p>
     <w:p>
@@ -88,7 +386,7 @@
         <w:spacing w:after="120" w:before="240"/>
       </w:pPr>
       <w:r>
-        <w:t xml:space="preserve">2. Before You Start</w:t>
+        <w:t xml:space="preserve">3. Code</w:t>
       </w:r>
     </w:p>
     <w:p>
@@ -101,7 +399,7 @@
         <w:spacing w:after="60"/>
       </w:pPr>
       <w:r>
-        <w:t xml:space="preserve">An AWS account with access to EC2, RDS and S3.</w:t>
+        <w:t xml:space="preserve">Backend: the gate API (register entry, approve, admit, exit, gate register report).</w:t>
       </w:r>
     </w:p>
     <w:p>
@@ -114,7 +412,7 @@
         <w:spacing w:after="60"/>
       </w:pPr>
       <w:r>
-        <w:t xml:space="preserve">Access to the existing dashboard code and its deployment.</w:t>
+        <w:t xml:space="preserve">Database scripts: tables for visitors, gate entries and the people on each entry.</w:t>
       </w:r>
     </w:p>
     <w:p>
@@ -127,7 +425,7 @@
         <w:spacing w:after="60"/>
       </w:pPr>
       <w:r>
-        <w:t xml:space="preserve">A subdomain for the API (e.g. gate-api.yourdomain.com).</w:t>
+        <w:t xml:space="preserve">Frontend: the Gate Entry page, the Gate Register report and the photo/badge components, for the dashboard.</w:t>
       </w:r>
     </w:p>
     <w:p>
@@ -140,7 +438,7 @@
         <w:spacing w:after="60"/>
       </w:pPr>
       <w:r>
-        <w:t xml:space="preserve">The feature’s login and photo upload code switched to the dashboard login and S3.</w:t>
+        <w:t xml:space="preserve">Login and photo upload code switched to the dashboard login and S3.</w:t>
       </w:r>
     </w:p>
     <w:p>
@@ -149,297 +447,7 @@
         <w:spacing w:after="120" w:before="240"/>
       </w:pPr>
       <w:r>
-        <w:t xml:space="preserve">3. Steps</w:t>
-      </w:r>
-    </w:p>
-    <w:p>
-      <w:pPr>
-        <w:spacing w:after="60" w:before="0"/>
-      </w:pPr>
-      <w:r>
-        <w:rPr>
-          <w:b/>
-          <w:bCs/>
-        </w:rPr>
-        <w:t xml:space="preserve">Database (RDS)</w:t>
-      </w:r>
-    </w:p>
-    <w:p>
-      <w:pPr>
-        <w:pStyle w:val="ListParagraph"/>
-        <w:numPr>
-          <w:ilvl w:val="0"/>
-          <w:numId w:val="3"/>
-        </w:numPr>
-        <w:spacing w:after="60"/>
-      </w:pPr>
-      <w:r>
-        <w:t xml:space="preserve">Create an RDS PostgreSQL database (db.t3.micro, 20 GB, private), or use the existing one.</w:t>
-      </w:r>
-    </w:p>
-    <w:p>
-      <w:pPr>
-        <w:pStyle w:val="ListParagraph"/>
-        <w:numPr>
-          <w:ilvl w:val="0"/>
-          <w:numId w:val="3"/>
-        </w:numPr>
-        <w:spacing w:after="60"/>
-      </w:pPr>
-      <w:r>
-        <w:t xml:space="preserve">Run the gate migration scripts to create the tables.</w:t>
-      </w:r>
-    </w:p>
-    <w:p>
-      <w:pPr>
-        <w:pStyle w:val="ListParagraph"/>
-        <w:numPr>
-          <w:ilvl w:val="0"/>
-          <w:numId w:val="3"/>
-        </w:numPr>
-        <w:spacing w:after="60"/>
-      </w:pPr>
-      <w:r>
-        <w:t xml:space="preserve">Check the tables visitors, gate_entries and gate_entry_persons exist.</w:t>
-      </w:r>
-    </w:p>
-    <w:p>
-      <w:pPr>
-        <w:spacing w:after="60" w:before="120"/>
-      </w:pPr>
-      <w:r>
-        <w:rPr>
-          <w:b/>
-          <w:bCs/>
-        </w:rPr>
-        <w:t xml:space="preserve">Photo storage (S3)</w:t>
-      </w:r>
-    </w:p>
-    <w:p>
-      <w:pPr>
-        <w:pStyle w:val="ListParagraph"/>
-        <w:numPr>
-          <w:ilvl w:val="0"/>
-          <w:numId w:val="4"/>
-        </w:numPr>
-        <w:spacing w:after="60"/>
-      </w:pPr>
-      <w:r>
-        <w:t xml:space="preserve">Create a private S3 bucket (e.g. gate-id-photos) with public access blocked.</w:t>
-      </w:r>
-    </w:p>
-    <w:p>
-      <w:pPr>
-        <w:pStyle w:val="ListParagraph"/>
-        <w:numPr>
-          <w:ilvl w:val="0"/>
-          <w:numId w:val="4"/>
-        </w:numPr>
-        <w:spacing w:after="60"/>
-      </w:pPr>
-      <w:r>
-        <w:t xml:space="preserve">Create an IAM role that can read and write only this bucket, and attach it to the EC2 instance.</w:t>
-      </w:r>
-    </w:p>
-    <w:p>
-      <w:pPr>
-        <w:spacing w:after="60" w:before="120"/>
-      </w:pPr>
-      <w:r>
-        <w:rPr>
-          <w:b/>
-          <w:bCs/>
-        </w:rPr>
-        <w:t xml:space="preserve">Backend (EC2)</w:t>
-      </w:r>
-    </w:p>
-    <w:p>
-      <w:pPr>
-        <w:pStyle w:val="ListParagraph"/>
-        <w:numPr>
-          <w:ilvl w:val="0"/>
-          <w:numId w:val="5"/>
-        </w:numPr>
-        <w:spacing w:after="60"/>
-      </w:pPr>
-      <w:r>
-        <w:t xml:space="preserve">Launch a t3.micro Ubuntu instance in ap-south-1. Allow ports 80 and 443 only.</w:t>
-      </w:r>
-    </w:p>
-    <w:p>
-      <w:pPr>
-        <w:pStyle w:val="ListParagraph"/>
-        <w:numPr>
-          <w:ilvl w:val="0"/>
-          <w:numId w:val="5"/>
-        </w:numPr>
-        <w:spacing w:after="60"/>
-      </w:pPr>
-      <w:r>
-        <w:t xml:space="preserve">Install Python 3.11 and Nginx, then copy the backend folder to the server.</w:t>
-      </w:r>
-    </w:p>
-    <w:p>
-      <w:pPr>
-        <w:pStyle w:val="ListParagraph"/>
-        <w:numPr>
-          <w:ilvl w:val="0"/>
-          <w:numId w:val="5"/>
-        </w:numPr>
-        <w:spacing w:after="60"/>
-      </w:pPr>
-      <w:r>
-        <w:t xml:space="preserve">Run: pip install -r requirements.txt</w:t>
-      </w:r>
-    </w:p>
-    <w:p>
-      <w:pPr>
-        <w:pStyle w:val="ListParagraph"/>
-        <w:numPr>
-          <w:ilvl w:val="0"/>
-          <w:numId w:val="5"/>
-        </w:numPr>
-        <w:spacing w:after="60"/>
-      </w:pPr>
-      <w:r>
-        <w:t xml:space="preserve">Add the environment variables in section 4.</w:t>
-      </w:r>
-    </w:p>
-    <w:p>
-      <w:pPr>
-        <w:pStyle w:val="ListParagraph"/>
-        <w:numPr>
-          <w:ilvl w:val="0"/>
-          <w:numId w:val="5"/>
-        </w:numPr>
-        <w:spacing w:after="60"/>
-      </w:pPr>
-      <w:r>
-        <w:t xml:space="preserve">Run the API as a service: uvicorn app.main:app --host 127.0.0.1 --port 8000</w:t>
-      </w:r>
-    </w:p>
-    <w:p>
-      <w:pPr>
-        <w:pStyle w:val="ListParagraph"/>
-        <w:numPr>
-          <w:ilvl w:val="0"/>
-          <w:numId w:val="5"/>
-        </w:numPr>
-        <w:spacing w:after="60"/>
-      </w:pPr>
-      <w:r>
-        <w:t xml:space="preserve">Point the subdomain to the instance and set up Nginx with a free SSL certificate (Certbot).</w:t>
-      </w:r>
-    </w:p>
-    <w:p>
-      <w:pPr>
-        <w:pStyle w:val="ListParagraph"/>
-        <w:numPr>
-          <w:ilvl w:val="0"/>
-          <w:numId w:val="5"/>
-        </w:numPr>
-        <w:spacing w:after="60"/>
-      </w:pPr>
-      <w:r>
-        <w:t xml:space="preserve">Open https://&lt;api-subdomain&gt;/health and confirm it says OK.</w:t>
-      </w:r>
-    </w:p>
-    <w:p>
-      <w:pPr>
-        <w:spacing w:after="60" w:before="120"/>
-      </w:pPr>
-      <w:r>
-        <w:rPr>
-          <w:b/>
-          <w:bCs/>
-        </w:rPr>
-        <w:t xml:space="preserve">Frontend (existing dashboard)</w:t>
-      </w:r>
-    </w:p>
-    <w:p>
-      <w:pPr>
-        <w:pStyle w:val="ListParagraph"/>
-        <w:numPr>
-          <w:ilvl w:val="0"/>
-          <w:numId w:val="6"/>
-        </w:numPr>
-        <w:spacing w:after="60"/>
-      </w:pPr>
-      <w:r>
-        <w:t xml:space="preserve">Copy the Gate Entry page and the photo/badge components into the dashboard.</w:t>
-      </w:r>
-    </w:p>
-    <w:p>
-      <w:pPr>
-        <w:pStyle w:val="ListParagraph"/>
-        <w:numPr>
-          <w:ilvl w:val="0"/>
-          <w:numId w:val="6"/>
-        </w:numPr>
-        <w:spacing w:after="60"/>
-      </w:pPr>
-      <w:r>
-        <w:t xml:space="preserve">Add menu links for "Gate Entry" and "Gate Register".</w:t>
-      </w:r>
-    </w:p>
-    <w:p>
-      <w:pPr>
-        <w:pStyle w:val="ListParagraph"/>
-        <w:numPr>
-          <w:ilvl w:val="0"/>
-          <w:numId w:val="6"/>
-        </w:numPr>
-        <w:spacing w:after="60"/>
-      </w:pPr>
-      <w:r>
-        <w:t xml:space="preserve">Point the API address to the new backend URL.</w:t>
-      </w:r>
-    </w:p>
-    <w:p>
-      <w:pPr>
-        <w:pStyle w:val="ListParagraph"/>
-        <w:numPr>
-          <w:ilvl w:val="0"/>
-          <w:numId w:val="6"/>
-        </w:numPr>
-        <w:spacing w:after="60"/>
-      </w:pPr>
-      <w:r>
-        <w:t xml:space="preserve">Redeploy the dashboard as usual.</w:t>
-      </w:r>
-    </w:p>
-    <w:p>
-      <w:pPr>
-        <w:spacing w:after="60" w:before="120"/>
-      </w:pPr>
-      <w:r>
-        <w:rPr>
-          <w:b/>
-          <w:bCs/>
-        </w:rPr>
-        <w:t xml:space="preserve">Users</w:t>
-      </w:r>
-    </w:p>
-    <w:p>
-      <w:pPr>
-        <w:pStyle w:val="ListParagraph"/>
-        <w:numPr>
-          <w:ilvl w:val="0"/>
-          <w:numId w:val="7"/>
-        </w:numPr>
-        <w:spacing w:after="60"/>
-      </w:pPr>
-      <w:r>
-        <w:t xml:space="preserve">Create the 2 accounts: one Security Guard, one Ops Manager (approver).</w:t>
-      </w:r>
-    </w:p>
-    <w:p>
-      <w:pPr>
-        <w:pStyle w:val="Heading1"/>
-        <w:spacing w:after="120" w:before="240"/>
-      </w:pPr>
-      <w:r>
-        <w:t xml:space="preserve">4. Environment Variables</w:t>
+        <w:t xml:space="preserve">4. Configuration Values</w:t>
       </w:r>
     </w:p>
     <w:tbl>
@@ -841,19 +849,11 @@
     </w:tbl>
     <w:p>
       <w:pPr>
-        <w:spacing w:after="120" w:before="120"/>
-      </w:pPr>
-      <w:r>
-        <w:t xml:space="preserve">No AWS keys are needed on the server; the EC2 IAM role gives access to S3.</w:t>
-      </w:r>
-    </w:p>
-    <w:p>
-      <w:pPr>
         <w:pStyle w:val="Heading1"/>
         <w:spacing w:after="120" w:before="240"/>
       </w:pPr>
       <w:r>
-        <w:t xml:space="preserve">5. Check It Works</w:t>
+        <w:t xml:space="preserve">5. Access and Other Items</w:t>
       </w:r>
     </w:p>
     <w:p>
@@ -866,7 +866,7 @@
         <w:spacing w:after="60"/>
       </w:pPr>
       <w:r>
-        <w:t xml:space="preserve">Guard logs in, enters a mobile number and registers a vehicle with a driver and photo.</w:t>
+        <w:t xml:space="preserve">AWS account access to EC2, RDS, S3 and IAM.</w:t>
       </w:r>
     </w:p>
     <w:p>
@@ -879,7 +879,7 @@
         <w:spacing w:after="60"/>
       </w:pPr>
       <w:r>
-        <w:t xml:space="preserve">Approver logs in and approves it.</w:t>
+        <w:t xml:space="preserve">Access to the existing dashboard code and its deployment.</w:t>
       </w:r>
     </w:p>
     <w:p>
@@ -892,7 +892,7 @@
         <w:spacing w:after="60"/>
       </w:pPr>
       <w:r>
-        <w:t xml:space="preserve">Guard admits the vehicle: time in is recorded.</w:t>
+        <w:t xml:space="preserve">A subdomain for the API (e.g. gate-api.yourdomain.com) and access to its DNS.</w:t>
       </w:r>
     </w:p>
     <w:p>
@@ -905,68 +905,7 @@
         <w:spacing w:after="60"/>
       </w:pPr>
       <w:r>
-        <w:t xml:space="preserve">Vehicle leaves: time out is recorded.</w:t>
-      </w:r>
-    </w:p>
-    <w:p>
-      <w:pPr>
-        <w:pStyle w:val="ListParagraph"/>
-        <w:numPr>
-          <w:ilvl w:val="0"/>
-          <w:numId w:val="2"/>
-        </w:numPr>
-        <w:spacing w:after="60"/>
-      </w:pPr>
-      <w:r>
-        <w:t xml:space="preserve">Gate Register shows the person with all details and both times.</w:t>
-      </w:r>
-    </w:p>
-    <w:p>
-      <w:pPr>
-        <w:pStyle w:val="Heading1"/>
-        <w:spacing w:after="120" w:before="240"/>
-      </w:pPr>
-      <w:r>
-        <w:t xml:space="preserve">6. If Something Goes Wrong</w:t>
-      </w:r>
-    </w:p>
-    <w:p>
-      <w:pPr>
-        <w:pStyle w:val="ListParagraph"/>
-        <w:numPr>
-          <w:ilvl w:val="0"/>
-          <w:numId w:val="2"/>
-        </w:numPr>
-        <w:spacing w:after="60"/>
-      </w:pPr>
-      <w:r>
-        <w:t xml:space="preserve">Roll back by deploying the previous backend version on EC2 and the previous dashboard version.</w:t>
-      </w:r>
-    </w:p>
-    <w:p>
-      <w:pPr>
-        <w:pStyle w:val="ListParagraph"/>
-        <w:numPr>
-          <w:ilvl w:val="0"/>
-          <w:numId w:val="2"/>
-        </w:numPr>
-        <w:spacing w:after="60"/>
-      </w:pPr>
-      <w:r>
-        <w:t xml:space="preserve">The gate tables are new, so they do not affect the existing dashboard.</w:t>
-      </w:r>
-    </w:p>
-    <w:p>
-      <w:pPr>
-        <w:pStyle w:val="ListParagraph"/>
-        <w:numPr>
-          <w:ilvl w:val="0"/>
-          <w:numId w:val="2"/>
-        </w:numPr>
-        <w:spacing w:after="60"/>
-      </w:pPr>
-      <w:r>
-        <w:t xml:space="preserve">RDS keeps 7 days of backups if data needs restoring.</w:t>
+        <w:t xml:space="preserve">2 user accounts: 1 Security Guard, 1 Ops Manager (approver).</w:t>
       </w:r>
     </w:p>
     <w:sectPr>
@@ -1151,66 +1090,6 @@
       </w:pPr>
     </w:lvl>
   </w:abstractNum>
-  <w:abstractNum w:abstractNumId="3" w15:restartNumberingAfterBreak="0">
-    <w:multiLevelType w:val="hybridMultilevel"/>
-    <w:lvl w:ilvl="0" w:tentative="1">
-      <w:start w:val="1"/>
-      <w:numFmt w:val="decimal"/>
-      <w:lvlText w:val="%1."/>
-      <w:lvlJc w:val="left"/>
-      <w:pPr>
-        <w:ind w:left="540" w:hanging="360"/>
-      </w:pPr>
-    </w:lvl>
-  </w:abstractNum>
-  <w:abstractNum w:abstractNumId="4" w15:restartNumberingAfterBreak="0">
-    <w:multiLevelType w:val="hybridMultilevel"/>
-    <w:lvl w:ilvl="0" w:tentative="1">
-      <w:start w:val="1"/>
-      <w:numFmt w:val="decimal"/>
-      <w:lvlText w:val="%1."/>
-      <w:lvlJc w:val="left"/>
-      <w:pPr>
-        <w:ind w:left="540" w:hanging="360"/>
-      </w:pPr>
-    </w:lvl>
-  </w:abstractNum>
-  <w:abstractNum w:abstractNumId="5" w15:restartNumberingAfterBreak="0">
-    <w:multiLevelType w:val="hybridMultilevel"/>
-    <w:lvl w:ilvl="0" w:tentative="1">
-      <w:start w:val="1"/>
-      <w:numFmt w:val="decimal"/>
-      <w:lvlText w:val="%1."/>
-      <w:lvlJc w:val="left"/>
-      <w:pPr>
-        <w:ind w:left="540" w:hanging="360"/>
-      </w:pPr>
-    </w:lvl>
-  </w:abstractNum>
-  <w:abstractNum w:abstractNumId="6" w15:restartNumberingAfterBreak="0">
-    <w:multiLevelType w:val="hybridMultilevel"/>
-    <w:lvl w:ilvl="0" w:tentative="1">
-      <w:start w:val="1"/>
-      <w:numFmt w:val="decimal"/>
-      <w:lvlText w:val="%1."/>
-      <w:lvlJc w:val="left"/>
-      <w:pPr>
-        <w:ind w:left="540" w:hanging="360"/>
-      </w:pPr>
-    </w:lvl>
-  </w:abstractNum>
-  <w:abstractNum w:abstractNumId="7" w15:restartNumberingAfterBreak="0">
-    <w:multiLevelType w:val="hybridMultilevel"/>
-    <w:lvl w:ilvl="0" w:tentative="1">
-      <w:start w:val="1"/>
-      <w:numFmt w:val="decimal"/>
-      <w:lvlText w:val="%1."/>
-      <w:lvlJc w:val="left"/>
-      <w:pPr>
-        <w:ind w:left="540" w:hanging="360"/>
-      </w:pPr>
-    </w:lvl>
-  </w:abstractNum>
   <w:num w:numId="1">
     <w:abstractNumId w:val="1"/>
     <w:lvlOverride w:ilvl="0">
@@ -1219,36 +1098,6 @@
   </w:num>
   <w:num w:numId="2">
     <w:abstractNumId w:val="2"/>
-    <w:lvlOverride w:ilvl="0">
-      <w:startOverride w:val="1"/>
-    </w:lvlOverride>
-  </w:num>
-  <w:num w:numId="3">
-    <w:abstractNumId w:val="3"/>
-    <w:lvlOverride w:ilvl="0">
-      <w:startOverride w:val="1"/>
-    </w:lvlOverride>
-  </w:num>
-  <w:num w:numId="4">
-    <w:abstractNumId w:val="4"/>
-    <w:lvlOverride w:ilvl="0">
-      <w:startOverride w:val="1"/>
-    </w:lvlOverride>
-  </w:num>
-  <w:num w:numId="5">
-    <w:abstractNumId w:val="5"/>
-    <w:lvlOverride w:ilvl="0">
-      <w:startOverride w:val="1"/>
-    </w:lvlOverride>
-  </w:num>
-  <w:num w:numId="6">
-    <w:abstractNumId w:val="6"/>
-    <w:lvlOverride w:ilvl="0">
-      <w:startOverride w:val="1"/>
-    </w:lvlOverride>
-  </w:num>
-  <w:num w:numId="7">
-    <w:abstractNumId w:val="7"/>
     <w:lvlOverride w:ilvl="0">
       <w:startOverride w:val="1"/>
     </w:lvlOverride>

</xml_diff>

<commit_message>
Rewrite the gate docs in the DevOps request format and add a repo hosting request
Deployment and infra docs now follow Description / Action Plan / Impact
Assessment / Rollback Plan, and a repository hosting request covers moving
R360-warehouse to the company GitHub organization.

Co-Authored-By: Claude Opus 5.5 <noreply@anthropic.com>
</commit_message>
<xml_diff>
--- a/docs/Gate Register - Deployment Guide.docx
+++ b/docs/Gate Register - Deployment Guide.docx
@@ -7,7 +7,7 @@
         <w:pStyle w:val="Title"/>
       </w:pPr>
       <w:r>
-        <w:t xml:space="preserve">Gate Register: Deployment Requirements</w:t>
+        <w:t xml:space="preserve">Deployment Requirements</w:t>
       </w:r>
     </w:p>
     <w:p>
@@ -18,16 +18,76 @@
         <w:rPr>
           <w:color w:val="595959"/>
         </w:rPr>
-        <w:t xml:space="preserve">Everything needed to deploy the gate entry/exit feature into the existing dashboard on AWS</w:t>
+        <w:t xml:space="preserve">Reward360 Warehouse — Gate Register (Visitor Entry/Exit)</w:t>
       </w:r>
     </w:p>
     <w:p>
       <w:pPr>
         <w:pStyle w:val="Heading1"/>
-        <w:spacing w:after="120" w:before="240"/>
-      </w:pPr>
-      <w:r>
-        <w:t xml:space="preserve">1. AWS Resources</w:t>
+        <w:spacing w:after="120" w:before="280"/>
+      </w:pPr>
+      <w:r>
+        <w:t xml:space="preserve">Description</w:t>
+      </w:r>
+    </w:p>
+    <w:p>
+      <w:pPr>
+        <w:spacing w:after="120"/>
+      </w:pPr>
+      <w:r>
+        <w:t xml:space="preserve">The Gate Register records every person and vehicle that enters or leaves the warehouse. The security guard registers the entry (name, mobile, role, ID photo, vehicle, vendor), the Ops Manager approves it, the guard admits the visitor and prints a 52 mm badge sticker, and records the exit. A Gate Register report lists who came in, who left and when.</w:t>
+      </w:r>
+    </w:p>
+    <w:p>
+      <w:pPr>
+        <w:spacing w:after="120"/>
+      </w:pPr>
+      <w:r>
+        <w:t xml:space="preserve">Business need: move the locally verified gate feature into the existing company dashboard on AWS, so guards and the approver use it every day instead of it running only on a development machine. This document is shared ahead of the deployment window so DevOps can prepare the infrastructure in parallel with the remaining development.</w:t>
+      </w:r>
+    </w:p>
+    <w:p>
+      <w:pPr>
+        <w:pStyle w:val="Heading1"/>
+        <w:spacing w:after="120" w:before="280"/>
+      </w:pPr>
+      <w:r>
+        <w:t xml:space="preserve">Action Plan</w:t>
+      </w:r>
+    </w:p>
+    <w:p>
+      <w:pPr>
+        <w:spacing w:after="120"/>
+      </w:pPr>
+      <w:r>
+        <w:rPr>
+          <w:b/>
+          <w:bCs/>
+        </w:rPr>
+        <w:t xml:space="preserve">App:</w:t>
+      </w:r>
+      <w:r>
+        <w:t xml:space="preserve"> gate API (backend) plus gate screens in the existing dashboard, with PostgreSQL and S3. </w:t>
+      </w:r>
+      <w:r>
+        <w:rPr>
+          <w:b/>
+          <w:bCs/>
+        </w:rPr>
+        <w:t xml:space="preserve">Repo:</w:t>
+      </w:r>
+      <w:r>
+        <w:t xml:space="preserve"> R360-warehouse, </w:t>
+      </w:r>
+      <w:r>
+        <w:rPr>
+          <w:b/>
+          <w:bCs/>
+        </w:rPr>
+        <w:t xml:space="preserve">branch:</w:t>
+      </w:r>
+      <w:r>
+        <w:t xml:space="preserve"> main</w:t>
       </w:r>
     </w:p>
     <w:tbl>
@@ -43,20 +103,24 @@
         </w:tblBorders>
       </w:tblPr>
       <w:tblGrid>
-        <w:gridCol w:w="2600"/>
-        <w:gridCol w:w="6426"/>
+        <w:gridCol w:w="2100"/>
+        <w:gridCol w:w="3200"/>
+        <w:gridCol w:w="3726"/>
       </w:tblGrid>
       <w:tr>
+        <w:trPr>
+          <w:tblHeader/>
+        </w:trPr>
         <w:tc>
           <w:tcPr>
-            <w:tcW w:type="dxa" w:w="2600"/>
+            <w:tcW w:type="dxa" w:w="2100"/>
             <w:tcBorders>
               <w:top w:val="single" w:color="BFBFBF" w:sz="4"/>
               <w:left w:val="single" w:color="BFBFBF" w:sz="4"/>
               <w:bottom w:val="single" w:color="BFBFBF" w:sz="4"/>
               <w:right w:val="single" w:color="BFBFBF" w:sz="4"/>
             </w:tcBorders>
-            <w:shd w:fill="D9E2F3" w:color="auto" w:val="clear"/>
+            <w:shd w:fill="E7EEF7" w:color="auto" w:val="clear"/>
             <w:tcMar>
               <w:top w:type="dxa" w:w="60"/>
               <w:left w:type="dxa" w:w="100"/>
@@ -70,20 +134,20 @@
                 <w:b/>
                 <w:bCs/>
               </w:rPr>
-              <w:t xml:space="preserve">Resource</w:t>
+              <w:t xml:space="preserve">Component</w:t>
             </w:r>
           </w:p>
         </w:tc>
         <w:tc>
           <w:tcPr>
-            <w:tcW w:type="dxa" w:w="6426"/>
+            <w:tcW w:type="dxa" w:w="3200"/>
             <w:tcBorders>
               <w:top w:val="single" w:color="BFBFBF" w:sz="4"/>
               <w:left w:val="single" w:color="BFBFBF" w:sz="4"/>
               <w:bottom w:val="single" w:color="BFBFBF" w:sz="4"/>
               <w:right w:val="single" w:color="BFBFBF" w:sz="4"/>
             </w:tcBorders>
-            <w:shd w:fill="D9E2F3" w:color="auto" w:val="clear"/>
+            <w:shd w:fill="E7EEF7" w:color="auto" w:val="clear"/>
             <w:tcMar>
               <w:top w:type="dxa" w:w="60"/>
               <w:left w:type="dxa" w:w="100"/>
@@ -97,15 +161,45 @@
                 <w:b/>
                 <w:bCs/>
               </w:rPr>
-              <w:t xml:space="preserve">Details</w:t>
+              <w:t xml:space="preserve">Technology</w:t>
+            </w:r>
+          </w:p>
+        </w:tc>
+        <w:tc>
+          <w:tcPr>
+            <w:tcW w:type="dxa" w:w="3726"/>
+            <w:tcBorders>
+              <w:top w:val="single" w:color="BFBFBF" w:sz="4"/>
+              <w:left w:val="single" w:color="BFBFBF" w:sz="4"/>
+              <w:bottom w:val="single" w:color="BFBFBF" w:sz="4"/>
+              <w:right w:val="single" w:color="BFBFBF" w:sz="4"/>
+            </w:tcBorders>
+            <w:shd w:fill="E7EEF7" w:color="auto" w:val="clear"/>
+            <w:tcMar>
+              <w:top w:type="dxa" w:w="60"/>
+              <w:left w:type="dxa" w:w="100"/>
+              <w:bottom w:type="dxa" w:w="60"/>
+              <w:right w:type="dxa" w:w="100"/>
+            </w:tcMar>
+          </w:tcPr>
+          <w:p>
+            <w:r>
+              <w:rPr>
+                <w:b/>
+                <w:bCs/>
+              </w:rPr>
+              <w:t xml:space="preserve">Purpose</w:t>
             </w:r>
           </w:p>
         </w:tc>
       </w:tr>
       <w:tr>
+        <w:trPr>
+          <w:tblHeader w:val="off"/>
+        </w:trPr>
         <w:tc>
           <w:tcPr>
-            <w:tcW w:type="dxa" w:w="2600"/>
+            <w:tcW w:type="dxa" w:w="2100"/>
             <w:tcBorders>
               <w:top w:val="single" w:color="BFBFBF" w:sz="4"/>
               <w:left w:val="single" w:color="BFBFBF" w:sz="4"/>
@@ -125,13 +219,13 @@
                 <w:b w:val="false"/>
                 <w:bCs w:val="false"/>
               </w:rPr>
-              <w:t xml:space="preserve">EC2</w:t>
+              <w:t xml:space="preserve">Backend (gate API)</w:t>
             </w:r>
           </w:p>
         </w:tc>
         <w:tc>
           <w:tcPr>
-            <w:tcW w:type="dxa" w:w="6426"/>
+            <w:tcW w:type="dxa" w:w="3200"/>
             <w:tcBorders>
               <w:top w:val="single" w:color="BFBFBF" w:sz="4"/>
               <w:left w:val="single" w:color="BFBFBF" w:sz="4"/>
@@ -151,15 +245,13 @@
                 <w:b w:val="false"/>
                 <w:bCs w:val="false"/>
               </w:rPr>
-              <w:t xml:space="preserve">1 × t3.micro, Ubuntu, ap-south-1 (Mumbai), ports 80 and 443 open</w:t>
+              <w:t xml:space="preserve">Python 3.11, FastAPI, SQLAlchemy (async) + asyncpg</w:t>
             </w:r>
           </w:p>
         </w:tc>
-      </w:tr>
-      <w:tr>
         <w:tc>
           <w:tcPr>
-            <w:tcW w:type="dxa" w:w="2600"/>
+            <w:tcW w:type="dxa" w:w="3726"/>
             <w:tcBorders>
               <w:top w:val="single" w:color="BFBFBF" w:sz="4"/>
               <w:left w:val="single" w:color="BFBFBF" w:sz="4"/>
@@ -179,13 +271,18 @@
                 <w:b w:val="false"/>
                 <w:bCs w:val="false"/>
               </w:rPr>
-              <w:t xml:space="preserve">RDS PostgreSQL</w:t>
+              <w:t xml:space="preserve">Register entry, approve, admit, exit, Gate Register report</w:t>
             </w:r>
           </w:p>
         </w:tc>
+      </w:tr>
+      <w:tr>
+        <w:trPr>
+          <w:tblHeader w:val="off"/>
+        </w:trPr>
         <w:tc>
           <w:tcPr>
-            <w:tcW w:type="dxa" w:w="6426"/>
+            <w:tcW w:type="dxa" w:w="2100"/>
             <w:tcBorders>
               <w:top w:val="single" w:color="BFBFBF" w:sz="4"/>
               <w:left w:val="single" w:color="BFBFBF" w:sz="4"/>
@@ -205,15 +302,13 @@
                 <w:b w:val="false"/>
                 <w:bCs w:val="false"/>
               </w:rPr>
-              <w:t xml:space="preserve">1 × db.t3.micro, 20 GB, private, 7-day backups (or the existing RDS)</w:t>
+              <w:t xml:space="preserve">Database</w:t>
             </w:r>
           </w:p>
         </w:tc>
-      </w:tr>
-      <w:tr>
         <w:tc>
           <w:tcPr>
-            <w:tcW w:type="dxa" w:w="2600"/>
+            <w:tcW w:type="dxa" w:w="3200"/>
             <w:tcBorders>
               <w:top w:val="single" w:color="BFBFBF" w:sz="4"/>
               <w:left w:val="single" w:color="BFBFBF" w:sz="4"/>
@@ -233,13 +328,13 @@
                 <w:b w:val="false"/>
                 <w:bCs w:val="false"/>
               </w:rPr>
-              <w:t xml:space="preserve">S3</w:t>
+              <w:t xml:space="preserve">Amazon RDS PostgreSQL, SQL migration scripts</w:t>
             </w:r>
           </w:p>
         </w:tc>
         <w:tc>
           <w:tcPr>
-            <w:tcW w:type="dxa" w:w="6426"/>
+            <w:tcW w:type="dxa" w:w="3726"/>
             <w:tcBorders>
               <w:top w:val="single" w:color="BFBFBF" w:sz="4"/>
               <w:left w:val="single" w:color="BFBFBF" w:sz="4"/>
@@ -259,15 +354,18 @@
                 <w:b w:val="false"/>
                 <w:bCs w:val="false"/>
               </w:rPr>
-              <w:t xml:space="preserve">1 private bucket for visitor ID photos, public access blocked</w:t>
+              <w:t xml:space="preserve">Tables for visitors, gate entries and the people on each entry</w:t>
             </w:r>
           </w:p>
         </w:tc>
       </w:tr>
       <w:tr>
+        <w:trPr>
+          <w:tblHeader w:val="off"/>
+        </w:trPr>
         <w:tc>
           <w:tcPr>
-            <w:tcW w:type="dxa" w:w="2600"/>
+            <w:tcW w:type="dxa" w:w="2100"/>
             <w:tcBorders>
               <w:top w:val="single" w:color="BFBFBF" w:sz="4"/>
               <w:left w:val="single" w:color="BFBFBF" w:sz="4"/>
@@ -287,13 +385,13 @@
                 <w:b w:val="false"/>
                 <w:bCs w:val="false"/>
               </w:rPr>
-              <w:t xml:space="preserve">IAM role</w:t>
+              <w:t xml:space="preserve">Photo storage</w:t>
             </w:r>
           </w:p>
         </w:tc>
         <w:tc>
           <w:tcPr>
-            <w:tcW w:type="dxa" w:w="6426"/>
+            <w:tcW w:type="dxa" w:w="3200"/>
             <w:tcBorders>
               <w:top w:val="single" w:color="BFBFBF" w:sz="4"/>
               <w:left w:val="single" w:color="BFBFBF" w:sz="4"/>
@@ -313,219 +411,13 @@
                 <w:b w:val="false"/>
                 <w:bCs w:val="false"/>
               </w:rPr>
-              <w:t xml:space="preserve">Attached to EC2, read/write access to the photo bucket only</w:t>
-            </w:r>
-          </w:p>
-        </w:tc>
-      </w:tr>
-    </w:tbl>
-    <w:p>
-      <w:pPr>
-        <w:pStyle w:val="Heading1"/>
-        <w:spacing w:after="120" w:before="240"/>
-      </w:pPr>
-      <w:r>
-        <w:t xml:space="preserve">2. Software on the Server</w:t>
-      </w:r>
-    </w:p>
-    <w:p>
-      <w:pPr>
-        <w:pStyle w:val="ListParagraph"/>
-        <w:numPr>
-          <w:ilvl w:val="0"/>
-          <w:numId w:val="2"/>
-        </w:numPr>
-        <w:spacing w:after="60"/>
-      </w:pPr>
-      <w:r>
-        <w:t xml:space="preserve">Python 3.11</w:t>
-      </w:r>
-    </w:p>
-    <w:p>
-      <w:pPr>
-        <w:pStyle w:val="ListParagraph"/>
-        <w:numPr>
-          <w:ilvl w:val="0"/>
-          <w:numId w:val="2"/>
-        </w:numPr>
-        <w:spacing w:after="60"/>
-      </w:pPr>
-      <w:r>
-        <w:t xml:space="preserve">Nginx</w:t>
-      </w:r>
-    </w:p>
-    <w:p>
-      <w:pPr>
-        <w:pStyle w:val="ListParagraph"/>
-        <w:numPr>
-          <w:ilvl w:val="0"/>
-          <w:numId w:val="2"/>
-        </w:numPr>
-        <w:spacing w:after="60"/>
-      </w:pPr>
-      <w:r>
-        <w:t xml:space="preserve">Free SSL certificate (Certbot / Let’s Encrypt)</w:t>
-      </w:r>
-    </w:p>
-    <w:p>
-      <w:pPr>
-        <w:pStyle w:val="ListParagraph"/>
-        <w:numPr>
-          <w:ilvl w:val="0"/>
-          <w:numId w:val="2"/>
-        </w:numPr>
-        <w:spacing w:after="60"/>
-      </w:pPr>
-      <w:r>
-        <w:t xml:space="preserve">Backend Python packages (listed in requirements.txt)</w:t>
-      </w:r>
-    </w:p>
-    <w:p>
-      <w:pPr>
-        <w:pStyle w:val="Heading1"/>
-        <w:spacing w:after="120" w:before="240"/>
-      </w:pPr>
-      <w:r>
-        <w:t xml:space="preserve">3. Code</w:t>
-      </w:r>
-    </w:p>
-    <w:p>
-      <w:pPr>
-        <w:pStyle w:val="ListParagraph"/>
-        <w:numPr>
-          <w:ilvl w:val="0"/>
-          <w:numId w:val="2"/>
-        </w:numPr>
-        <w:spacing w:after="60"/>
-      </w:pPr>
-      <w:r>
-        <w:t xml:space="preserve">Backend: the gate API (register entry, approve, admit, exit, gate register report).</w:t>
-      </w:r>
-    </w:p>
-    <w:p>
-      <w:pPr>
-        <w:pStyle w:val="ListParagraph"/>
-        <w:numPr>
-          <w:ilvl w:val="0"/>
-          <w:numId w:val="2"/>
-        </w:numPr>
-        <w:spacing w:after="60"/>
-      </w:pPr>
-      <w:r>
-        <w:t xml:space="preserve">Database scripts: tables for visitors, gate entries and the people on each entry.</w:t>
-      </w:r>
-    </w:p>
-    <w:p>
-      <w:pPr>
-        <w:pStyle w:val="ListParagraph"/>
-        <w:numPr>
-          <w:ilvl w:val="0"/>
-          <w:numId w:val="2"/>
-        </w:numPr>
-        <w:spacing w:after="60"/>
-      </w:pPr>
-      <w:r>
-        <w:t xml:space="preserve">Frontend: the Gate Entry page, the Gate Register report and the photo/badge components, for the dashboard.</w:t>
-      </w:r>
-    </w:p>
-    <w:p>
-      <w:pPr>
-        <w:pStyle w:val="ListParagraph"/>
-        <w:numPr>
-          <w:ilvl w:val="0"/>
-          <w:numId w:val="2"/>
-        </w:numPr>
-        <w:spacing w:after="60"/>
-      </w:pPr>
-      <w:r>
-        <w:t xml:space="preserve">Login and photo upload code switched to the dashboard login and S3.</w:t>
-      </w:r>
-    </w:p>
-    <w:p>
-      <w:pPr>
-        <w:pStyle w:val="Heading1"/>
-        <w:spacing w:after="120" w:before="240"/>
-      </w:pPr>
-      <w:r>
-        <w:t xml:space="preserve">4. Configuration Values</w:t>
-      </w:r>
-    </w:p>
-    <w:tbl>
-      <w:tblPr>
-        <w:tblW w:type="dxa" w:w="9026"/>
-        <w:tblBorders>
-          <w:top w:val="single" w:color="auto" w:sz="4"/>
-          <w:left w:val="single" w:color="auto" w:sz="4"/>
-          <w:bottom w:val="single" w:color="auto" w:sz="4"/>
-          <w:right w:val="single" w:color="auto" w:sz="4"/>
-          <w:insideH w:val="single" w:color="auto" w:sz="4"/>
-          <w:insideV w:val="single" w:color="auto" w:sz="4"/>
-        </w:tblBorders>
-      </w:tblPr>
-      <w:tblGrid>
-        <w:gridCol w:w="3400"/>
-        <w:gridCol w:w="5626"/>
-      </w:tblGrid>
-      <w:tr>
-        <w:tc>
-          <w:tcPr>
-            <w:tcW w:type="dxa" w:w="3400"/>
-            <w:tcBorders>
-              <w:top w:val="single" w:color="BFBFBF" w:sz="4"/>
-              <w:left w:val="single" w:color="BFBFBF" w:sz="4"/>
-              <w:bottom w:val="single" w:color="BFBFBF" w:sz="4"/>
-              <w:right w:val="single" w:color="BFBFBF" w:sz="4"/>
-            </w:tcBorders>
-            <w:shd w:fill="D9E2F3" w:color="auto" w:val="clear"/>
-            <w:tcMar>
-              <w:top w:type="dxa" w:w="60"/>
-              <w:left w:type="dxa" w:w="100"/>
-              <w:bottom w:type="dxa" w:w="60"/>
-              <w:right w:type="dxa" w:w="100"/>
-            </w:tcMar>
-          </w:tcPr>
-          <w:p>
-            <w:r>
-              <w:rPr>
-                <w:b/>
-                <w:bCs/>
-              </w:rPr>
-              <w:t xml:space="preserve">Name</w:t>
+              <w:t xml:space="preserve">Amazon S3, private bucket</w:t>
             </w:r>
           </w:p>
         </w:tc>
         <w:tc>
           <w:tcPr>
-            <w:tcW w:type="dxa" w:w="5626"/>
-            <w:tcBorders>
-              <w:top w:val="single" w:color="BFBFBF" w:sz="4"/>
-              <w:left w:val="single" w:color="BFBFBF" w:sz="4"/>
-              <w:bottom w:val="single" w:color="BFBFBF" w:sz="4"/>
-              <w:right w:val="single" w:color="BFBFBF" w:sz="4"/>
-            </w:tcBorders>
-            <w:shd w:fill="D9E2F3" w:color="auto" w:val="clear"/>
-            <w:tcMar>
-              <w:top w:type="dxa" w:w="60"/>
-              <w:left w:type="dxa" w:w="100"/>
-              <w:bottom w:type="dxa" w:w="60"/>
-              <w:right w:type="dxa" w:w="100"/>
-            </w:tcMar>
-          </w:tcPr>
-          <w:p>
-            <w:r>
-              <w:rPr>
-                <w:b/>
-                <w:bCs/>
-              </w:rPr>
-              <w:t xml:space="preserve">Value</w:t>
-            </w:r>
-          </w:p>
-        </w:tc>
-      </w:tr>
-      <w:tr>
-        <w:tc>
-          <w:tcPr>
-            <w:tcW w:type="dxa" w:w="3400"/>
+            <w:tcW w:type="dxa" w:w="3726"/>
             <w:tcBorders>
               <w:top w:val="single" w:color="BFBFBF" w:sz="4"/>
               <w:left w:val="single" w:color="BFBFBF" w:sz="4"/>
@@ -545,13 +437,18 @@
                 <w:b w:val="false"/>
                 <w:bCs w:val="false"/>
               </w:rPr>
-              <w:t xml:space="preserve">DATABASE_URL</w:t>
+              <w:t xml:space="preserve">Visitor ID photos</w:t>
             </w:r>
           </w:p>
         </w:tc>
+      </w:tr>
+      <w:tr>
+        <w:trPr>
+          <w:tblHeader w:val="off"/>
+        </w:trPr>
         <w:tc>
           <w:tcPr>
-            <w:tcW w:type="dxa" w:w="5626"/>
+            <w:tcW w:type="dxa" w:w="2100"/>
             <w:tcBorders>
               <w:top w:val="single" w:color="BFBFBF" w:sz="4"/>
               <w:left w:val="single" w:color="BFBFBF" w:sz="4"/>
@@ -571,15 +468,13 @@
                 <w:b w:val="false"/>
                 <w:bCs w:val="false"/>
               </w:rPr>
-              <w:t xml:space="preserve">RDS connection string</w:t>
+              <w:t xml:space="preserve">Frontend</w:t>
             </w:r>
           </w:p>
         </w:tc>
-      </w:tr>
-      <w:tr>
         <w:tc>
           <w:tcPr>
-            <w:tcW w:type="dxa" w:w="3400"/>
+            <w:tcW w:type="dxa" w:w="3200"/>
             <w:tcBorders>
               <w:top w:val="single" w:color="BFBFBF" w:sz="4"/>
               <w:left w:val="single" w:color="BFBFBF" w:sz="4"/>
@@ -599,13 +494,13 @@
                 <w:b w:val="false"/>
                 <w:bCs w:val="false"/>
               </w:rPr>
-              <w:t xml:space="preserve">S3_BUCKET</w:t>
+              <w:t xml:space="preserve">React + TypeScript (Vite)</w:t>
             </w:r>
           </w:p>
         </w:tc>
         <w:tc>
           <w:tcPr>
-            <w:tcW w:type="dxa" w:w="5626"/>
+            <w:tcW w:type="dxa" w:w="3726"/>
             <w:tcBorders>
               <w:top w:val="single" w:color="BFBFBF" w:sz="4"/>
               <w:left w:val="single" w:color="BFBFBF" w:sz="4"/>
@@ -625,15 +520,18 @@
                 <w:b w:val="false"/>
                 <w:bCs w:val="false"/>
               </w:rPr>
-              <w:t xml:space="preserve">Photo bucket name</w:t>
+              <w:t xml:space="preserve">Gate Entry page, Gate Register report, photo capture and badge components, added to the dashboard</w:t>
             </w:r>
           </w:p>
         </w:tc>
       </w:tr>
       <w:tr>
+        <w:trPr>
+          <w:tblHeader w:val="off"/>
+        </w:trPr>
         <w:tc>
           <w:tcPr>
-            <w:tcW w:type="dxa" w:w="3400"/>
+            <w:tcW w:type="dxa" w:w="2100"/>
             <w:tcBorders>
               <w:top w:val="single" w:color="BFBFBF" w:sz="4"/>
               <w:left w:val="single" w:color="BFBFBF" w:sz="4"/>
@@ -653,13 +551,13 @@
                 <w:b w:val="false"/>
                 <w:bCs w:val="false"/>
               </w:rPr>
-              <w:t xml:space="preserve">AWS_REGION</w:t>
+              <w:t xml:space="preserve">Web server</w:t>
             </w:r>
           </w:p>
         </w:tc>
         <w:tc>
           <w:tcPr>
-            <w:tcW w:type="dxa" w:w="5626"/>
+            <w:tcW w:type="dxa" w:w="3200"/>
             <w:tcBorders>
               <w:top w:val="single" w:color="BFBFBF" w:sz="4"/>
               <w:left w:val="single" w:color="BFBFBF" w:sz="4"/>
@@ -679,15 +577,13 @@
                 <w:b w:val="false"/>
                 <w:bCs w:val="false"/>
               </w:rPr>
-              <w:t xml:space="preserve">ap-south-1</w:t>
+              <w:t xml:space="preserve">Nginx + Let's Encrypt certificate on EC2</w:t>
             </w:r>
           </w:p>
         </w:tc>
-      </w:tr>
-      <w:tr>
         <w:tc>
           <w:tcPr>
-            <w:tcW w:type="dxa" w:w="3400"/>
+            <w:tcW w:type="dxa" w:w="3726"/>
             <w:tcBorders>
               <w:top w:val="single" w:color="BFBFBF" w:sz="4"/>
               <w:left w:val="single" w:color="BFBFBF" w:sz="4"/>
@@ -707,141 +603,7 @@
                 <w:b w:val="false"/>
                 <w:bCs w:val="false"/>
               </w:rPr>
-              <w:t xml:space="preserve">JWT_SECRET</w:t>
-            </w:r>
-          </w:p>
-        </w:tc>
-        <w:tc>
-          <w:tcPr>
-            <w:tcW w:type="dxa" w:w="5626"/>
-            <w:tcBorders>
-              <w:top w:val="single" w:color="BFBFBF" w:sz="4"/>
-              <w:left w:val="single" w:color="BFBFBF" w:sz="4"/>
-              <w:bottom w:val="single" w:color="BFBFBF" w:sz="4"/>
-              <w:right w:val="single" w:color="BFBFBF" w:sz="4"/>
-            </w:tcBorders>
-            <w:tcMar>
-              <w:top w:type="dxa" w:w="60"/>
-              <w:left w:type="dxa" w:w="100"/>
-              <w:bottom w:type="dxa" w:w="60"/>
-              <w:right w:type="dxa" w:w="100"/>
-            </w:tcMar>
-          </w:tcPr>
-          <w:p>
-            <w:r>
-              <w:rPr>
-                <w:b w:val="false"/>
-                <w:bCs w:val="false"/>
-              </w:rPr>
-              <w:t xml:space="preserve">Secret used by the dashboard login (keep secret)</w:t>
-            </w:r>
-          </w:p>
-        </w:tc>
-      </w:tr>
-      <w:tr>
-        <w:tc>
-          <w:tcPr>
-            <w:tcW w:type="dxa" w:w="3400"/>
-            <w:tcBorders>
-              <w:top w:val="single" w:color="BFBFBF" w:sz="4"/>
-              <w:left w:val="single" w:color="BFBFBF" w:sz="4"/>
-              <w:bottom w:val="single" w:color="BFBFBF" w:sz="4"/>
-              <w:right w:val="single" w:color="BFBFBF" w:sz="4"/>
-            </w:tcBorders>
-            <w:tcMar>
-              <w:top w:type="dxa" w:w="60"/>
-              <w:left w:type="dxa" w:w="100"/>
-              <w:bottom w:type="dxa" w:w="60"/>
-              <w:right w:type="dxa" w:w="100"/>
-            </w:tcMar>
-          </w:tcPr>
-          <w:p>
-            <w:r>
-              <w:rPr>
-                <w:b w:val="false"/>
-                <w:bCs w:val="false"/>
-              </w:rPr>
-              <w:t xml:space="preserve">CORS_ORIGINS</w:t>
-            </w:r>
-          </w:p>
-        </w:tc>
-        <w:tc>
-          <w:tcPr>
-            <w:tcW w:type="dxa" w:w="5626"/>
-            <w:tcBorders>
-              <w:top w:val="single" w:color="BFBFBF" w:sz="4"/>
-              <w:left w:val="single" w:color="BFBFBF" w:sz="4"/>
-              <w:bottom w:val="single" w:color="BFBFBF" w:sz="4"/>
-              <w:right w:val="single" w:color="BFBFBF" w:sz="4"/>
-            </w:tcBorders>
-            <w:tcMar>
-              <w:top w:type="dxa" w:w="60"/>
-              <w:left w:type="dxa" w:w="100"/>
-              <w:bottom w:type="dxa" w:w="60"/>
-              <w:right w:type="dxa" w:w="100"/>
-            </w:tcMar>
-          </w:tcPr>
-          <w:p>
-            <w:r>
-              <w:rPr>
-                <w:b w:val="false"/>
-                <w:bCs w:val="false"/>
-              </w:rPr>
-              <w:t xml:space="preserve">The dashboard URL</w:t>
-            </w:r>
-          </w:p>
-        </w:tc>
-      </w:tr>
-      <w:tr>
-        <w:tc>
-          <w:tcPr>
-            <w:tcW w:type="dxa" w:w="3400"/>
-            <w:tcBorders>
-              <w:top w:val="single" w:color="BFBFBF" w:sz="4"/>
-              <w:left w:val="single" w:color="BFBFBF" w:sz="4"/>
-              <w:bottom w:val="single" w:color="BFBFBF" w:sz="4"/>
-              <w:right w:val="single" w:color="BFBFBF" w:sz="4"/>
-            </w:tcBorders>
-            <w:tcMar>
-              <w:top w:type="dxa" w:w="60"/>
-              <w:left w:type="dxa" w:w="100"/>
-              <w:bottom w:type="dxa" w:w="60"/>
-              <w:right w:type="dxa" w:w="100"/>
-            </w:tcMar>
-          </w:tcPr>
-          <w:p>
-            <w:r>
-              <w:rPr>
-                <w:b w:val="false"/>
-                <w:bCs w:val="false"/>
-              </w:rPr>
-              <w:t xml:space="preserve">ENVIRONMENT</w:t>
-            </w:r>
-          </w:p>
-        </w:tc>
-        <w:tc>
-          <w:tcPr>
-            <w:tcW w:type="dxa" w:w="5626"/>
-            <w:tcBorders>
-              <w:top w:val="single" w:color="BFBFBF" w:sz="4"/>
-              <w:left w:val="single" w:color="BFBFBF" w:sz="4"/>
-              <w:bottom w:val="single" w:color="BFBFBF" w:sz="4"/>
-              <w:right w:val="single" w:color="BFBFBF" w:sz="4"/>
-            </w:tcBorders>
-            <w:tcMar>
-              <w:top w:type="dxa" w:w="60"/>
-              <w:left w:type="dxa" w:w="100"/>
-              <w:bottom w:type="dxa" w:w="60"/>
-              <w:right w:type="dxa" w:w="100"/>
-            </w:tcMar>
-          </w:tcPr>
-          <w:p>
-            <w:r>
-              <w:rPr>
-                <w:b w:val="false"/>
-                <w:bCs w:val="false"/>
-              </w:rPr>
-              <w:t xml:space="preserve">production</w:t>
+              <w:t xml:space="preserve">HTTPS for the API (the phone camera needs HTTPS)</w:t>
             </w:r>
           </w:p>
         </w:tc>
@@ -849,63 +611,428 @@
     </w:tbl>
     <w:p>
       <w:pPr>
+        <w:spacing w:after="80" w:before="160"/>
+      </w:pPr>
+      <w:r>
+        <w:rPr>
+          <w:b/>
+          <w:bCs/>
+        </w:rPr>
+        <w:t xml:space="preserve">Deploy sequence</w:t>
+      </w:r>
+    </w:p>
+    <w:p>
+      <w:pPr>
+        <w:pStyle w:val="ListParagraph"/>
+        <w:numPr>
+          <w:ilvl w:val="0"/>
+          <w:numId w:val="2"/>
+        </w:numPr>
+        <w:spacing w:after="60"/>
+      </w:pPr>
+      <w:r>
+        <w:t xml:space="preserve">git pull — fetch the main branch on the EC2 server</w:t>
+      </w:r>
+    </w:p>
+    <w:p>
+      <w:pPr>
+        <w:pStyle w:val="ListParagraph"/>
+        <w:numPr>
+          <w:ilvl w:val="0"/>
+          <w:numId w:val="2"/>
+        </w:numPr>
+        <w:spacing w:after="60"/>
+      </w:pPr>
+      <w:r>
+        <w:t xml:space="preserve">Install or update the backend Python packages from backend/requirements.txt</w:t>
+      </w:r>
+    </w:p>
+    <w:p>
+      <w:pPr>
+        <w:pStyle w:val="ListParagraph"/>
+        <w:numPr>
+          <w:ilvl w:val="0"/>
+          <w:numId w:val="2"/>
+        </w:numPr>
+        <w:spacing w:after="60"/>
+      </w:pPr>
+      <w:r>
+        <w:t xml:space="preserve">Run the database migration scripts against RDS — required before the restart, as they create the gate tables</w:t>
+      </w:r>
+    </w:p>
+    <w:p>
+      <w:pPr>
+        <w:pStyle w:val="ListParagraph"/>
+        <w:numPr>
+          <w:ilvl w:val="0"/>
+          <w:numId w:val="2"/>
+        </w:numPr>
+        <w:spacing w:after="60"/>
+      </w:pPr>
+      <w:r>
+        <w:t xml:space="preserve">Build the gate screens and release them with the dashboard's normal deployment</w:t>
+      </w:r>
+    </w:p>
+    <w:p>
+      <w:pPr>
+        <w:pStyle w:val="ListParagraph"/>
+        <w:numPr>
+          <w:ilvl w:val="0"/>
+          <w:numId w:val="2"/>
+        </w:numPr>
+        <w:spacing w:after="60"/>
+      </w:pPr>
+      <w:r>
+        <w:t xml:space="preserve">Restart the API service behind Nginx — the database and the photo bucket are untouched</w:t>
+      </w:r>
+    </w:p>
+    <w:p>
+      <w:pPr>
+        <w:pStyle w:val="ListParagraph"/>
+        <w:numPr>
+          <w:ilvl w:val="0"/>
+          <w:numId w:val="2"/>
+        </w:numPr>
+        <w:spacing w:after="60"/>
+      </w:pPr>
+      <w:r>
+        <w:t xml:space="preserve">Verify: /health and /health/db return OK, then register, approve, admit and exit one test entry</w:t>
+      </w:r>
+    </w:p>
+    <w:p>
+      <w:pPr>
+        <w:spacing w:after="80" w:before="160"/>
+      </w:pPr>
+      <w:r>
+        <w:rPr>
+          <w:b/>
+          <w:bCs/>
+        </w:rPr>
+        <w:t xml:space="preserve">Configuration values</w:t>
+      </w:r>
+    </w:p>
+    <w:p>
+      <w:pPr>
+        <w:pStyle w:val="ListParagraph"/>
+        <w:numPr>
+          <w:ilvl w:val="0"/>
+          <w:numId w:val="3"/>
+        </w:numPr>
+        <w:spacing w:after="60"/>
+      </w:pPr>
+      <w:r>
+        <w:rPr>
+          <w:b/>
+          <w:bCs/>
+        </w:rPr>
+        <w:t xml:space="preserve">DATABASE_URL</w:t>
+      </w:r>
+      <w:r>
+        <w:t xml:space="preserve"> — RDS connection string</w:t>
+      </w:r>
+    </w:p>
+    <w:p>
+      <w:pPr>
+        <w:pStyle w:val="ListParagraph"/>
+        <w:numPr>
+          <w:ilvl w:val="0"/>
+          <w:numId w:val="3"/>
+        </w:numPr>
+        <w:spacing w:after="60"/>
+      </w:pPr>
+      <w:r>
+        <w:rPr>
+          <w:b/>
+          <w:bCs/>
+        </w:rPr>
+        <w:t xml:space="preserve">S3_BUCKET / AWS_REGION</w:t>
+      </w:r>
+      <w:r>
+        <w:t xml:space="preserve"> — photo bucket name, ap-south-1</w:t>
+      </w:r>
+    </w:p>
+    <w:p>
+      <w:pPr>
+        <w:pStyle w:val="ListParagraph"/>
+        <w:numPr>
+          <w:ilvl w:val="0"/>
+          <w:numId w:val="3"/>
+        </w:numPr>
+        <w:spacing w:after="60"/>
+      </w:pPr>
+      <w:r>
+        <w:rPr>
+          <w:b/>
+          <w:bCs/>
+        </w:rPr>
+        <w:t xml:space="preserve">JWT_SECRET</w:t>
+      </w:r>
+      <w:r>
+        <w:t xml:space="preserve"> — secret used by the dashboard login (keep secret)</w:t>
+      </w:r>
+    </w:p>
+    <w:p>
+      <w:pPr>
+        <w:pStyle w:val="ListParagraph"/>
+        <w:numPr>
+          <w:ilvl w:val="0"/>
+          <w:numId w:val="3"/>
+        </w:numPr>
+        <w:spacing w:after="60"/>
+      </w:pPr>
+      <w:r>
+        <w:rPr>
+          <w:b/>
+          <w:bCs/>
+        </w:rPr>
+        <w:t xml:space="preserve">CORS_ORIGINS</w:t>
+      </w:r>
+      <w:r>
+        <w:t xml:space="preserve"> — the dashboard URL</w:t>
+      </w:r>
+    </w:p>
+    <w:p>
+      <w:pPr>
+        <w:pStyle w:val="ListParagraph"/>
+        <w:numPr>
+          <w:ilvl w:val="0"/>
+          <w:numId w:val="3"/>
+        </w:numPr>
+        <w:spacing w:after="60"/>
+      </w:pPr>
+      <w:r>
+        <w:rPr>
+          <w:b/>
+          <w:bCs/>
+        </w:rPr>
+        <w:t xml:space="preserve">ENVIRONMENT</w:t>
+      </w:r>
+      <w:r>
+        <w:t xml:space="preserve"> — production</w:t>
+      </w:r>
+    </w:p>
+    <w:p>
+      <w:pPr>
+        <w:spacing w:after="80" w:before="160"/>
+      </w:pPr>
+      <w:r>
+        <w:rPr>
+          <w:b/>
+          <w:bCs/>
+        </w:rPr>
+        <w:t xml:space="preserve">Needed from DevOps</w:t>
+      </w:r>
+    </w:p>
+    <w:p>
+      <w:pPr>
+        <w:pStyle w:val="ListParagraph"/>
+        <w:numPr>
+          <w:ilvl w:val="0"/>
+          <w:numId w:val="3"/>
+        </w:numPr>
+        <w:spacing w:after="60"/>
+      </w:pPr>
+      <w:r>
+        <w:t xml:space="preserve">Access to the existing dashboard code and its deployment</w:t>
+      </w:r>
+    </w:p>
+    <w:p>
+      <w:pPr>
+        <w:pStyle w:val="ListParagraph"/>
+        <w:numPr>
+          <w:ilvl w:val="0"/>
+          <w:numId w:val="3"/>
+        </w:numPr>
+        <w:spacing w:after="60"/>
+      </w:pPr>
+      <w:r>
+        <w:t xml:space="preserve">A subdomain for the API (e.g. gate-api.yourdomain.com) and its DNS</w:t>
+      </w:r>
+    </w:p>
+    <w:p>
+      <w:pPr>
+        <w:pStyle w:val="ListParagraph"/>
+        <w:numPr>
+          <w:ilvl w:val="0"/>
+          <w:numId w:val="3"/>
+        </w:numPr>
+        <w:spacing w:after="60"/>
+      </w:pPr>
+      <w:r>
+        <w:t xml:space="preserve">2 user accounts on the dashboard login: 1 Security Guard, 1 Ops Manager (approver)</w:t>
+      </w:r>
+    </w:p>
+    <w:p>
+      <w:pPr>
         <w:pStyle w:val="Heading1"/>
-        <w:spacing w:after="120" w:before="240"/>
-      </w:pPr>
-      <w:r>
-        <w:t xml:space="preserve">5. Access and Other Items</w:t>
-      </w:r>
-    </w:p>
-    <w:p>
-      <w:pPr>
-        <w:pStyle w:val="ListParagraph"/>
-        <w:numPr>
-          <w:ilvl w:val="0"/>
-          <w:numId w:val="2"/>
-        </w:numPr>
-        <w:spacing w:after="60"/>
-      </w:pPr>
-      <w:r>
-        <w:t xml:space="preserve">AWS account access to EC2, RDS, S3 and IAM.</w:t>
-      </w:r>
-    </w:p>
-    <w:p>
-      <w:pPr>
-        <w:pStyle w:val="ListParagraph"/>
-        <w:numPr>
-          <w:ilvl w:val="0"/>
-          <w:numId w:val="2"/>
-        </w:numPr>
-        <w:spacing w:after="60"/>
-      </w:pPr>
-      <w:r>
-        <w:t xml:space="preserve">Access to the existing dashboard code and its deployment.</w:t>
-      </w:r>
-    </w:p>
-    <w:p>
-      <w:pPr>
-        <w:pStyle w:val="ListParagraph"/>
-        <w:numPr>
-          <w:ilvl w:val="0"/>
-          <w:numId w:val="2"/>
-        </w:numPr>
-        <w:spacing w:after="60"/>
-      </w:pPr>
-      <w:r>
-        <w:t xml:space="preserve">A subdomain for the API (e.g. gate-api.yourdomain.com) and access to its DNS.</w:t>
-      </w:r>
-    </w:p>
-    <w:p>
-      <w:pPr>
-        <w:pStyle w:val="ListParagraph"/>
-        <w:numPr>
-          <w:ilvl w:val="0"/>
-          <w:numId w:val="2"/>
-        </w:numPr>
-        <w:spacing w:after="60"/>
-      </w:pPr>
-      <w:r>
-        <w:t xml:space="preserve">2 user accounts: 1 Security Guard, 1 Ops Manager (approver).</w:t>
+        <w:spacing w:after="120" w:before="280"/>
+      </w:pPr>
+      <w:r>
+        <w:t xml:space="preserve">Impact Assessment</w:t>
+      </w:r>
+    </w:p>
+    <w:p>
+      <w:pPr>
+        <w:pStyle w:val="ListParagraph"/>
+        <w:numPr>
+          <w:ilvl w:val="0"/>
+          <w:numId w:val="3"/>
+        </w:numPr>
+        <w:spacing w:after="60"/>
+      </w:pPr>
+      <w:r>
+        <w:rPr>
+          <w:b/>
+          <w:bCs/>
+        </w:rPr>
+        <w:t xml:space="preserve">Application impact:</w:t>
+      </w:r>
+      <w:r>
+        <w:t xml:space="preserve"> additive — new API and new dashboard screens; existing dashboard features are not changed, only its login is shared</w:t>
+      </w:r>
+    </w:p>
+    <w:p>
+      <w:pPr>
+        <w:pStyle w:val="ListParagraph"/>
+        <w:numPr>
+          <w:ilvl w:val="0"/>
+          <w:numId w:val="3"/>
+        </w:numPr>
+        <w:spacing w:after="60"/>
+      </w:pPr>
+      <w:r>
+        <w:rPr>
+          <w:b/>
+          <w:bCs/>
+        </w:rPr>
+        <w:t xml:space="preserve">Service impact:</w:t>
+      </w:r>
+      <w:r>
+        <w:t xml:space="preserve"> nothing gate-related is live yet; once deployed, restarts affect only the gate API, with the database and photo bucket untouched</w:t>
+      </w:r>
+    </w:p>
+    <w:p>
+      <w:pPr>
+        <w:pStyle w:val="ListParagraph"/>
+        <w:numPr>
+          <w:ilvl w:val="0"/>
+          <w:numId w:val="3"/>
+        </w:numPr>
+        <w:spacing w:after="60"/>
+      </w:pPr>
+      <w:r>
+        <w:rPr>
+          <w:b/>
+          <w:bCs/>
+        </w:rPr>
+        <w:t xml:space="preserve">Performance impact:</w:t>
+      </w:r>
+      <w:r>
+        <w:t xml:space="preserve"> light — 2 users and up to ~100 entries a day, each with one ID photo of ~200 KB</w:t>
+      </w:r>
+    </w:p>
+    <w:p>
+      <w:pPr>
+        <w:pStyle w:val="ListParagraph"/>
+        <w:numPr>
+          <w:ilvl w:val="0"/>
+          <w:numId w:val="3"/>
+        </w:numPr>
+        <w:spacing w:after="60"/>
+      </w:pPr>
+      <w:r>
+        <w:rPr>
+          <w:b/>
+          <w:bCs/>
+        </w:rPr>
+        <w:t xml:space="preserve">Cost impact:</w:t>
+      </w:r>
+      <w:r>
+        <w:t xml:space="preserve"> ~$26 per month (EC2 t3.micro ~$8, RDS db.t3.micro ~$17, S3 under $1); about $9 if the dashboard's existing RDS is reused</w:t>
+      </w:r>
+    </w:p>
+    <w:p>
+      <w:pPr>
+        <w:pStyle w:val="ListParagraph"/>
+        <w:numPr>
+          <w:ilvl w:val="0"/>
+          <w:numId w:val="3"/>
+        </w:numPr>
+        <w:spacing w:after="60"/>
+      </w:pPr>
+      <w:r>
+        <w:rPr>
+          <w:b/>
+          <w:bCs/>
+        </w:rPr>
+        <w:t xml:space="preserve">Source systems impact:</w:t>
+      </w:r>
+      <w:r>
+        <w:t xml:space="preserve"> none — the feature reads user accounts from the dashboard login and writes only to its own tables and bucket</w:t>
+      </w:r>
+    </w:p>
+    <w:p>
+      <w:pPr>
+        <w:pStyle w:val="Heading1"/>
+        <w:spacing w:after="120" w:before="280"/>
+      </w:pPr>
+      <w:r>
+        <w:t xml:space="preserve">Rollback Plan</w:t>
+      </w:r>
+    </w:p>
+    <w:p>
+      <w:pPr>
+        <w:spacing w:after="120"/>
+      </w:pPr>
+      <w:r>
+        <w:t xml:space="preserve">Rollback uses the same mechanism as every future release — redeploy the previous known-good version:</w:t>
+      </w:r>
+    </w:p>
+    <w:p>
+      <w:pPr>
+        <w:pStyle w:val="ListParagraph"/>
+        <w:numPr>
+          <w:ilvl w:val="0"/>
+          <w:numId w:val="4"/>
+        </w:numPr>
+        <w:spacing w:after="60"/>
+      </w:pPr>
+      <w:r>
+        <w:t xml:space="preserve">Redeploy the previous known-good commit of the gate API, and the previous dashboard release without the gate screens</w:t>
+      </w:r>
+    </w:p>
+    <w:p>
+      <w:pPr>
+        <w:pStyle w:val="ListParagraph"/>
+        <w:numPr>
+          <w:ilvl w:val="0"/>
+          <w:numId w:val="4"/>
+        </w:numPr>
+        <w:spacing w:after="60"/>
+      </w:pPr>
+      <w:r>
+        <w:t xml:space="preserve">Leave the gate tables in place — the migrations are forward-only scripts, and the tables are new and used by nothing else, so keeping them is safe</w:t>
+      </w:r>
+    </w:p>
+    <w:p>
+      <w:pPr>
+        <w:pStyle w:val="ListParagraph"/>
+        <w:numPr>
+          <w:ilvl w:val="0"/>
+          <w:numId w:val="4"/>
+        </w:numPr>
+        <w:spacing w:after="60"/>
+      </w:pPr>
+      <w:r>
+        <w:t xml:space="preserve">Restart the API service</w:t>
+      </w:r>
+    </w:p>
+    <w:p>
+      <w:pPr>
+        <w:spacing w:after="120"/>
+      </w:pPr>
+      <w:r>
+        <w:t xml:space="preserve">No data cleanup is needed on rollback: recorded entries and ID photos are kept, and no step of the normal deploy deletes data.</w:t>
       </w:r>
     </w:p>
     <w:sectPr>
@@ -1086,7 +1213,43 @@
       <w:lvlText w:val="•"/>
       <w:lvlJc w:val="left"/>
       <w:pPr>
-        <w:ind w:left="540" w:hanging="270"/>
+        <w:ind w:left="720" w:hanging="360"/>
+      </w:pPr>
+    </w:lvl>
+  </w:abstractNum>
+  <w:abstractNum w:abstractNumId="3" w15:restartNumberingAfterBreak="0">
+    <w:multiLevelType w:val="hybridMultilevel"/>
+    <w:lvl w:ilvl="0" w:tentative="1">
+      <w:start w:val="1"/>
+      <w:numFmt w:val="decimal"/>
+      <w:lvlText w:val="%1."/>
+      <w:lvlJc w:val="left"/>
+      <w:pPr>
+        <w:ind w:left="720" w:hanging="360"/>
+      </w:pPr>
+    </w:lvl>
+  </w:abstractNum>
+  <w:abstractNum w:abstractNumId="4" w15:restartNumberingAfterBreak="0">
+    <w:multiLevelType w:val="hybridMultilevel"/>
+    <w:lvl w:ilvl="0" w:tentative="1">
+      <w:start w:val="1"/>
+      <w:numFmt w:val="decimal"/>
+      <w:lvlText w:val="%1."/>
+      <w:lvlJc w:val="left"/>
+      <w:pPr>
+        <w:ind w:left="720" w:hanging="360"/>
+      </w:pPr>
+    </w:lvl>
+  </w:abstractNum>
+  <w:abstractNum w:abstractNumId="5" w15:restartNumberingAfterBreak="0">
+    <w:multiLevelType w:val="hybridMultilevel"/>
+    <w:lvl w:ilvl="0" w:tentative="1">
+      <w:start w:val="1"/>
+      <w:numFmt w:val="decimal"/>
+      <w:lvlText w:val="%1."/>
+      <w:lvlJc w:val="left"/>
+      <w:pPr>
+        <w:ind w:left="720" w:hanging="360"/>
       </w:pPr>
     </w:lvl>
   </w:abstractNum>
@@ -1097,7 +1260,19 @@
     </w:lvlOverride>
   </w:num>
   <w:num w:numId="2">
+    <w:abstractNumId w:val="3"/>
+    <w:lvlOverride w:ilvl="0">
+      <w:startOverride w:val="1"/>
+    </w:lvlOverride>
+  </w:num>
+  <w:num w:numId="3">
     <w:abstractNumId w:val="2"/>
+    <w:lvlOverride w:ilvl="0">
+      <w:startOverride w:val="1"/>
+    </w:lvlOverride>
+  </w:num>
+  <w:num w:numId="4">
+    <w:abstractNumId w:val="4"/>
     <w:lvlOverride w:ilvl="0">
       <w:startOverride w:val="1"/>
     </w:lvlOverride>
@@ -1110,7 +1285,7 @@
   <w:docDefaults>
     <w:rPrDefault>
       <w:rPr>
-        <w:rFonts w:ascii="Arial" w:cs="Arial" w:eastAsia="Arial" w:hAnsi="Arial"/>
+        <w:rFonts w:ascii="Calibri" w:cs="Calibri" w:eastAsia="Calibri" w:hAnsi="Calibri"/>
         <w:sz w:val="22"/>
         <w:szCs w:val="22"/>
       </w:rPr>
@@ -1280,8 +1455,9 @@
     <w:rPr>
       <w:b/>
       <w:bCs/>
-      <w:sz w:val="36"/>
-      <w:szCs w:val="36"/>
+      <w:color w:val="1F3864"/>
+      <w:sz w:val="40"/>
+      <w:szCs w:val="40"/>
     </w:rPr>
   </w:style>
   <w:style w:type="paragraph" w:styleId="Heading1">
@@ -1295,9 +1471,9 @@
     <w:rPr>
       <w:b/>
       <w:bCs/>
-      <w:color w:val="1F3864"/>
-      <w:sz w:val="26"/>
-      <w:szCs w:val="26"/>
+      <w:color w:val="2E5597"/>
+      <w:sz w:val="28"/>
+      <w:szCs w:val="28"/>
     </w:rPr>
   </w:style>
 </w:styles>

</xml_diff>

<commit_message>
Follow the request templates' wording and structure in the gate docs
Co-Authored-By: Claude Opus 5.5 <noreply@anthropic.com>
</commit_message>
<xml_diff>
--- a/docs/Gate Register - Deployment Guide.docx
+++ b/docs/Gate Register - Deployment Guide.docx
@@ -91,23 +91,6 @@
           <w:szCs w:val="22"/>
         </w:rPr>
         <w:t xml:space="preserve">App: gate API and background worker plus PostgreSQL, all on one EC2 instance (512 MB RAM), with photos in S3 and the screens inside the existing dashboard, repo: R360-warehouse, branch: main</w:t>
-      </w:r>
-    </w:p>
-    <w:p>
-      <w:pPr>
-        <w:pStyle w:val="ListParagraph"/>
-        <w:numPr>
-          <w:ilvl w:val="0"/>
-          <w:numId w:val="2"/>
-        </w:numPr>
-        <w:spacing w:after="60"/>
-      </w:pPr>
-      <w:r>
-        <w:rPr>
-          <w:sz w:val="22"/>
-          <w:szCs w:val="22"/>
-        </w:rPr>
-        <w:t xml:space="preserve">Configuration supplied as environment variables on the server, never committed: DATABASE_URL, S3_BUCKET, AWS_REGION, JWT_SECRET, CORS_ORIGINS, ENVIRONMENT</w:t>
       </w:r>
     </w:p>
     <w:tbl>

</xml_diff>

<commit_message>
Use AWS services only in the gate deployment and infra docs
HTTPS moves to CloudFront with an ACM certificate, DNS to Route 53, email
to SES and secrets to Parameter Store; wording follows the request templates.

Co-Authored-By: Claude Opus 5.5 <noreply@anthropic.com>
</commit_message>
<xml_diff>
--- a/docs/Gate Register - Deployment Guide.docx
+++ b/docs/Gate Register - Deployment Guide.docx
@@ -57,7 +57,7 @@
           <w:sz w:val="22"/>
           <w:szCs w:val="22"/>
         </w:rPr>
-        <w:t xml:space="preserve">The Gate Register records every person and vehicle that enters or leaves the warehouse: the security guard registers the entry (name, mobile, role, ID photo, vehicle, vendor), the Ops Manager approves it, the guard admits the visitor with a printed badge sticker and records the exit, and a Gate Register report shows who came in, who left and when. Business need: move this feature, so far run and verified only on localhost, into the existing company dashboard on AWS so it is used every day at the gate, on the smallest infrastructure that can run it. This document is being shared ahead of the actual deployment window, so DevOps can plan and prepare infrastructure in parallel with ongoing development.</w:t>
+        <w:t xml:space="preserve">The Gate Register records every person and vehicle that enters or leaves the warehouse: the security guard registers the entry (name, mobile, role, ID photo, vehicle, vendor), the Ops Manager approves it, the guard admits the visitor with a printed badge sticker and records the exit, and a Gate Register report shows who came in, who left and when. Business need: move this feature, so far run and verified only on localhost, into a real, deployable environment on AWS so it can operate every day at the gate rather than requiring manual, local execution. This document is being shared ahead of the actual deployment window, so DevOps can plan and prepare infrastructure in parallel with ongoing development.</w:t>
       </w:r>
     </w:p>
     <w:p>
@@ -90,7 +90,7 @@
           <w:sz w:val="22"/>
           <w:szCs w:val="22"/>
         </w:rPr>
-        <w:t xml:space="preserve">App: gate API and background worker plus PostgreSQL, all on one EC2 instance (512 MB RAM), with photos in S3 and the screens inside the existing dashboard, repo: R360-warehouse, branch: main</w:t>
+        <w:t xml:space="preserve">App: gate API and background worker plus PostgreSQL on one Amazon EC2 instance, with the screens inside the existing dashboard, AWS services only, repo: R360-warehouse, branch: main</w:t>
       </w:r>
     </w:p>
     <w:tbl>
@@ -191,7 +191,7 @@
                 <w:sz w:val="20"/>
                 <w:szCs w:val="20"/>
               </w:rPr>
-              <w:t xml:space="preserve">Python 3.11, FastAPI, SQLAlchemy (async) + asyncpg, one process</w:t>
+              <w:t xml:space="preserve">Python 3.11, FastAPI, PostgreSQL (SQLAlchemy + asyncpg)</w:t>
             </w:r>
           </w:p>
         </w:tc>
@@ -235,7 +235,7 @@
                 <w:sz w:val="20"/>
                 <w:szCs w:val="20"/>
               </w:rPr>
-              <w:t xml:space="preserve">Python 3.11, one process</w:t>
+              <w:t xml:space="preserve">Python 3.11, Amazon SES for email</w:t>
             </w:r>
           </w:p>
         </w:tc>
@@ -279,21 +279,21 @@
                 <w:sz w:val="20"/>
                 <w:szCs w:val="20"/>
               </w:rPr>
-              <w:t xml:space="preserve">PostgreSQL on the same EC2 instance, SQL migration scripts</w:t>
-            </w:r>
-          </w:p>
-        </w:tc>
-        <w:tc>
-          <w:tcPr>
-            <w:tcW w:type="dxa" w:w="3000"/>
-          </w:tcPr>
-          <w:p>
-            <w:r>
-              <w:rPr>
-                <w:sz w:val="20"/>
-                <w:szCs w:val="20"/>
-              </w:rPr>
-              <w:t xml:space="preserve">Tables for visitors, gate entries and the people on each entry</w:t>
+              <w:t xml:space="preserve">PostgreSQL on the same EC2 instance, backed up to Amazon S3</w:t>
+            </w:r>
+          </w:p>
+        </w:tc>
+        <w:tc>
+          <w:tcPr>
+            <w:tcW w:type="dxa" w:w="3000"/>
+          </w:tcPr>
+          <w:p>
+            <w:r>
+              <w:rPr>
+                <w:sz w:val="20"/>
+                <w:szCs w:val="20"/>
+              </w:rPr>
+              <w:t xml:space="preserve">Visitors, gate entries and the people on each entry</w:t>
             </w:r>
           </w:p>
         </w:tc>
@@ -309,35 +309,35 @@
                 <w:sz w:val="20"/>
                 <w:szCs w:val="20"/>
               </w:rPr>
-              <w:t xml:space="preserve">Photo storage</w:t>
-            </w:r>
-          </w:p>
-        </w:tc>
-        <w:tc>
-          <w:tcPr>
-            <w:tcW w:type="dxa" w:w="3000"/>
-          </w:tcPr>
-          <w:p>
-            <w:r>
-              <w:rPr>
-                <w:sz w:val="20"/>
-                <w:szCs w:val="20"/>
-              </w:rPr>
-              <w:t xml:space="preserve">Amazon S3, one private bucket</w:t>
-            </w:r>
-          </w:p>
-        </w:tc>
-        <w:tc>
-          <w:tcPr>
-            <w:tcW w:type="dxa" w:w="3000"/>
-          </w:tcPr>
-          <w:p>
-            <w:r>
-              <w:rPr>
-                <w:sz w:val="20"/>
-                <w:szCs w:val="20"/>
-              </w:rPr>
-              <w:t xml:space="preserve">Visitor ID photos and nightly database backups</w:t>
+              <w:t xml:space="preserve">Frontend</w:t>
+            </w:r>
+          </w:p>
+        </w:tc>
+        <w:tc>
+          <w:tcPr>
+            <w:tcW w:type="dxa" w:w="3000"/>
+          </w:tcPr>
+          <w:p>
+            <w:r>
+              <w:rPr>
+                <w:sz w:val="20"/>
+                <w:szCs w:val="20"/>
+              </w:rPr>
+              <w:t xml:space="preserve">React + TypeScript (Vite)</w:t>
+            </w:r>
+          </w:p>
+        </w:tc>
+        <w:tc>
+          <w:tcPr>
+            <w:tcW w:type="dxa" w:w="3000"/>
+          </w:tcPr>
+          <w:p>
+            <w:r>
+              <w:rPr>
+                <w:sz w:val="20"/>
+                <w:szCs w:val="20"/>
+              </w:rPr>
+              <w:t xml:space="preserve">Gate Entry page, Gate Register report, photo capture and badge, inside the existing dashboard</w:t>
             </w:r>
           </w:p>
         </w:tc>
@@ -353,79 +353,35 @@
                 <w:sz w:val="20"/>
                 <w:szCs w:val="20"/>
               </w:rPr>
-              <w:t xml:space="preserve">Frontend</w:t>
-            </w:r>
-          </w:p>
-        </w:tc>
-        <w:tc>
-          <w:tcPr>
-            <w:tcW w:type="dxa" w:w="3000"/>
-          </w:tcPr>
-          <w:p>
-            <w:r>
-              <w:rPr>
-                <w:sz w:val="20"/>
-                <w:szCs w:val="20"/>
-              </w:rPr>
-              <w:t xml:space="preserve">React + TypeScript (Vite)</w:t>
-            </w:r>
-          </w:p>
-        </w:tc>
-        <w:tc>
-          <w:tcPr>
-            <w:tcW w:type="dxa" w:w="3000"/>
-          </w:tcPr>
-          <w:p>
-            <w:r>
-              <w:rPr>
-                <w:sz w:val="20"/>
-                <w:szCs w:val="20"/>
-              </w:rPr>
-              <w:t xml:space="preserve">Gate Entry page, Gate Register report, photo capture and badge, added to the existing dashboard</w:t>
-            </w:r>
-          </w:p>
-        </w:tc>
-      </w:tr>
-      <w:tr>
-        <w:tc>
-          <w:tcPr>
-            <w:tcW w:type="dxa" w:w="3000"/>
-          </w:tcPr>
-          <w:p>
-            <w:r>
-              <w:rPr>
-                <w:sz w:val="20"/>
-                <w:szCs w:val="20"/>
-              </w:rPr>
-              <w:t xml:space="preserve">Web server</w:t>
-            </w:r>
-          </w:p>
-        </w:tc>
-        <w:tc>
-          <w:tcPr>
-            <w:tcW w:type="dxa" w:w="3000"/>
-          </w:tcPr>
-          <w:p>
-            <w:r>
-              <w:rPr>
-                <w:sz w:val="20"/>
-                <w:szCs w:val="20"/>
-              </w:rPr>
-              <w:t xml:space="preserve">Nginx + free Let's Encrypt certificate</w:t>
-            </w:r>
-          </w:p>
-        </w:tc>
-        <w:tc>
-          <w:tcPr>
-            <w:tcW w:type="dxa" w:w="3000"/>
-          </w:tcPr>
-          <w:p>
-            <w:r>
-              <w:rPr>
-                <w:sz w:val="20"/>
-                <w:szCs w:val="20"/>
-              </w:rPr>
-              <w:t xml:space="preserve">HTTPS for the API (the phone camera needs HTTPS)</w:t>
+              <w:t xml:space="preserve">Edge and storage</w:t>
+            </w:r>
+          </w:p>
+        </w:tc>
+        <w:tc>
+          <w:tcPr>
+            <w:tcW w:type="dxa" w:w="3000"/>
+          </w:tcPr>
+          <w:p>
+            <w:r>
+              <w:rPr>
+                <w:sz w:val="20"/>
+                <w:szCs w:val="20"/>
+              </w:rPr>
+              <w:t xml:space="preserve">Amazon CloudFront + AWS Certificate Manager, Amazon S3, Route 53</w:t>
+            </w:r>
+          </w:p>
+        </w:tc>
+        <w:tc>
+          <w:tcPr>
+            <w:tcW w:type="dxa" w:w="3000"/>
+          </w:tcPr>
+          <w:p>
+            <w:r>
+              <w:rPr>
+                <w:sz w:val="20"/>
+                <w:szCs w:val="20"/>
+              </w:rPr>
+              <w:t xml:space="preserve">HTTPS for the API, ID photo storage, the API subdomain</w:t>
             </w:r>
           </w:p>
         </w:tc>
@@ -440,7 +396,7 @@
           <w:sz w:val="22"/>
           <w:szCs w:val="22"/>
         </w:rPr>
-        <w:t xml:space="preserve">Deploy sequence (single server, no containers, to stay within 512 MB):</w:t>
+        <w:t xml:space="preserve">Deploy sequence (single EC2 instance, no containers, to stay within 512 MB):</w:t>
       </w:r>
     </w:p>
     <w:p>
@@ -457,7 +413,7 @@
           <w:sz w:val="22"/>
           <w:szCs w:val="22"/>
         </w:rPr>
-        <w:t xml:space="preserve">git pull — fetch the main branch on the EC2 instance</w:t>
+        <w:t xml:space="preserve">git pull — fetch the target release branch</w:t>
       </w:r>
     </w:p>
     <w:p>
@@ -474,7 +430,7 @@
           <w:sz w:val="22"/>
           <w:szCs w:val="22"/>
         </w:rPr>
-        <w:t xml:space="preserve">Install or update the backend Python packages from backend/requirements.txt</w:t>
+        <w:t xml:space="preserve">Install the backend Python packages from backend/requirements.txt</w:t>
       </w:r>
     </w:p>
     <w:p>
@@ -491,7 +447,7 @@
           <w:sz w:val="22"/>
           <w:szCs w:val="22"/>
         </w:rPr>
-        <w:t xml:space="preserve">Run the database migration scripts against PostgreSQL — required; they create the gate tables</w:t>
+        <w:t xml:space="preserve">Load configuration and secrets from AWS Systems Manager Parameter Store</w:t>
       </w:r>
     </w:p>
     <w:p>
@@ -525,7 +481,7 @@
           <w:sz w:val="22"/>
           <w:szCs w:val="22"/>
         </w:rPr>
-        <w:t xml:space="preserve">Restart the API and worker services — the database and the photo bucket remain untouched</w:t>
+        <w:t xml:space="preserve">Run database migrations against PostgreSQL — required; they create the gate tables and fields</w:t>
       </w:r>
     </w:p>
     <w:p>
@@ -542,7 +498,24 @@
           <w:sz w:val="22"/>
           <w:szCs w:val="22"/>
         </w:rPr>
-        <w:t xml:space="preserve">Verify via /health and /health/db and the service logs, then run one test entry end to end</w:t>
+        <w:t xml:space="preserve">Restart the API and worker services — database and photo bucket remain untouched</w:t>
+      </w:r>
+    </w:p>
+    <w:p>
+      <w:pPr>
+        <w:pStyle w:val="ListParagraph"/>
+        <w:numPr>
+          <w:ilvl w:val="0"/>
+          <w:numId w:val="3"/>
+        </w:numPr>
+        <w:spacing w:after="60"/>
+      </w:pPr>
+      <w:r>
+        <w:rPr>
+          <w:sz w:val="22"/>
+          <w:szCs w:val="22"/>
+        </w:rPr>
+        <w:t xml:space="preserve">Verify via the /health and /health/db endpoints and service logs in Amazon CloudWatch</w:t>
       </w:r>
     </w:p>
     <w:p>
@@ -575,7 +548,7 @@
           <w:sz w:val="22"/>
           <w:szCs w:val="22"/>
         </w:rPr>
-        <w:t xml:space="preserve">Application impact: additive — a new API and new dashboard screens; existing dashboard features are not changed, only its login is shared</w:t>
+        <w:t xml:space="preserve">Application impact: additive — this is the feature's first real deployment, not a change to an existing live setup; no prior production workflows exist to disrupt</w:t>
       </w:r>
     </w:p>
     <w:p>
@@ -592,7 +565,7 @@
           <w:sz w:val="22"/>
           <w:szCs w:val="22"/>
         </w:rPr>
-        <w:t xml:space="preserve">Service impact: nothing gate-related is live yet; once deployed, ordinary restarts affect only the gate API and worker, with the database and photo bucket untouched</w:t>
+        <w:t xml:space="preserve">Service impact: none yet live to affect; once deployed, ordinary restarts will affect only the API and worker services, with the database and photo bucket untouched</w:t>
       </w:r>
     </w:p>
     <w:p>
@@ -609,7 +582,7 @@
           <w:sz w:val="22"/>
           <w:szCs w:val="22"/>
         </w:rPr>
-        <w:t xml:space="preserve">Performance impact: light — 2 users and up to ~100 entries a day, each with one ID photo of ~200 KB, which fits a 512 MB instance with a small swap file</w:t>
+        <w:t xml:space="preserve">Performance impact: expected to be light — 2 users and up to ~100 gate entries a day, each with one ID photo of ~200 KB, not continuous high-throughput traffic</w:t>
       </w:r>
     </w:p>
     <w:p>
@@ -626,7 +599,7 @@
           <w:sz w:val="22"/>
           <w:szCs w:val="22"/>
         </w:rPr>
-        <w:t xml:space="preserve">Cost impact: about $9 per month — EC2 t3.nano ~$4, its static public IP ~$4, 8 GB disk under $1, S3 under $1; no RDS, load balancer or other paid services</w:t>
+        <w:t xml:space="preserve">Cost impact: about $9 per month, all AWS — EC2 t3.nano ~$4, Elastic IP ~$4, EBS 8 GB under $1, Route 53 $0.50, S3, CloudFront, SES and Parameter Store within free or near-free usage; certificate from AWS Certificate Manager at no charge</w:t>
       </w:r>
     </w:p>
     <w:p>
@@ -643,7 +616,7 @@
           <w:sz w:val="22"/>
           <w:szCs w:val="22"/>
         </w:rPr>
-        <w:t xml:space="preserve">Source systems impact: none — the feature reads user accounts from the dashboard login and writes only to its own tables and bucket</w:t>
+        <w:t xml:space="preserve">Source systems impact: none — the feature reads user accounts from the existing dashboard login and writes only to its own tables and bucket; no external system is written to</w:t>
       </w:r>
     </w:p>
     <w:p>
@@ -671,7 +644,7 @@
           <w:sz w:val="22"/>
           <w:szCs w:val="22"/>
         </w:rPr>
-        <w:t xml:space="preserve">Since this covers the feature's first deployment rather than an update to an existing live version, rollback here means reverting to the previous known-good commit, the same mechanism used for every future release:</w:t>
+        <w:t xml:space="preserve">Since this covers the feature's first deployment rather than an update to an existing live version, rollback here means reverting to the previous known-good release, the same mechanism used for every future release:</w:t>
       </w:r>
     </w:p>
     <w:p>
@@ -705,7 +678,7 @@
           <w:sz w:val="22"/>
           <w:szCs w:val="22"/>
         </w:rPr>
-        <w:t xml:space="preserve">Leave the gate tables in place — the migration scripts are forward-only, and the tables are new and used by nothing else, so keeping them is safe</w:t>
+        <w:t xml:space="preserve">Leave the gate tables in place — the migrations are forward-only, and the tables are new and used by nothing else, so keeping them is safe</w:t>
       </w:r>
     </w:p>
     <w:p>

</xml_diff>